<commit_message>
Formato 1 y cronograma finalizados
</commit_message>
<xml_diff>
--- a/Entregables/Formato1.docx
+++ b/Entregables/Formato1.docx
@@ -1024,7 +1024,7 @@
           <w:szCs w:val="22"/>
           <w:lang w:val="es-EC"/>
         </w:rPr>
-        <w:t>Ingeniería en Software</w:t>
+        <w:t>Software</w:t>
       </w:r>
     </w:p>
     <w:p>
@@ -1561,6 +1561,7 @@
         <w:rPr>
           <w:rFonts w:ascii="Times New Roman" w:hAnsi="Times New Roman"/>
           <w:b/>
+          <w:iCs/>
           <w:sz w:val="18"/>
           <w:szCs w:val="18"/>
           <w:lang w:val="es-EC"/>
@@ -1641,25 +1642,27 @@
           <w:szCs w:val="18"/>
           <w:lang w:val="es-EC"/>
         </w:rPr>
-        <w:t xml:space="preserve"> _</w:t>
-      </w:r>
-      <w:r>
-        <w:rPr>
-          <w:rFonts w:ascii="Times New Roman" w:hAnsi="Times New Roman"/>
-          <w:sz w:val="18"/>
-          <w:szCs w:val="18"/>
-          <w:lang w:val="es-EC"/>
-        </w:rPr>
-        <w:t>___________________________</w:t>
-      </w:r>
-      <w:r>
-        <w:rPr>
-          <w:rFonts w:ascii="Times New Roman" w:hAnsi="Times New Roman"/>
-          <w:sz w:val="18"/>
-          <w:szCs w:val="18"/>
-          <w:lang w:val="es-EC"/>
-        </w:rPr>
-        <w:t>_____</w:t>
+        <w:t xml:space="preserve"> </w:t>
+      </w:r>
+      <w:r>
+        <w:rPr>
+          <w:rFonts w:ascii="Times New Roman" w:hAnsi="Times New Roman"/>
+          <w:iCs/>
+          <w:sz w:val="18"/>
+          <w:szCs w:val="18"/>
+          <w:lang w:val="es-EC"/>
+        </w:rPr>
+        <w:t>mkt</w:t>
+      </w:r>
+      <w:r>
+        <w:rPr>
+          <w:rFonts w:ascii="Times New Roman" w:hAnsi="Times New Roman"/>
+          <w:iCs/>
+          <w:sz w:val="18"/>
+          <w:szCs w:val="18"/>
+          <w:lang w:val="es-EC"/>
+        </w:rPr>
+        <w:t>mswolq@gmail.com</w:t>
       </w:r>
     </w:p>
     <w:p>
@@ -2053,16 +2056,16 @@
           <w:szCs w:val="18"/>
           <w:lang w:val="es-EC"/>
         </w:rPr>
-        <w:t xml:space="preserve"> _________________________________________________________________________</w:t>
-      </w:r>
-      <w:r>
-        <w:rPr>
-          <w:rFonts w:ascii="Times New Roman" w:hAnsi="Times New Roman"/>
-          <w:sz w:val="18"/>
-          <w:szCs w:val="18"/>
-          <w:lang w:val="es-EC"/>
-        </w:rPr>
-        <w:t>_____</w:t>
+        <w:t xml:space="preserve"> </w:t>
+      </w:r>
+      <w:r>
+        <w:rPr>
+          <w:rFonts w:ascii="Times New Roman" w:hAnsi="Times New Roman"/>
+          <w:sz w:val="18"/>
+          <w:szCs w:val="18"/>
+          <w:lang w:val="es-EC"/>
+        </w:rPr>
+        <w:t>Jenny Alexandra Robalino Ruiz</w:t>
       </w:r>
     </w:p>
     <w:p>
@@ -2078,6 +2081,7 @@
           <w:lang w:val="es-EC"/>
         </w:rPr>
       </w:pPr>
+      <w:proofErr w:type="spellStart"/>
       <w:r>
         <w:rPr>
           <w:rFonts w:ascii="Times New Roman" w:hAnsi="Times New Roman"/>
@@ -2086,16 +2090,36 @@
           <w:szCs w:val="18"/>
           <w:lang w:val="es-EC"/>
         </w:rPr>
-        <w:t>Nº de Cédula:</w:t>
-      </w:r>
-      <w:r>
-        <w:rPr>
-          <w:rFonts w:ascii="Times New Roman" w:hAnsi="Times New Roman"/>
-          <w:sz w:val="18"/>
-          <w:szCs w:val="18"/>
-          <w:lang w:val="es-EC"/>
-        </w:rPr>
-        <w:t xml:space="preserve"> ________________________________</w:t>
+        <w:t>Nº</w:t>
+      </w:r>
+      <w:proofErr w:type="spellEnd"/>
+      <w:r>
+        <w:rPr>
+          <w:rFonts w:ascii="Times New Roman" w:hAnsi="Times New Roman"/>
+          <w:i/>
+          <w:sz w:val="18"/>
+          <w:szCs w:val="18"/>
+          <w:lang w:val="es-EC"/>
+        </w:rPr>
+        <w:t xml:space="preserve"> de Cédula:</w:t>
+      </w:r>
+      <w:r>
+        <w:rPr>
+          <w:rFonts w:ascii="Times New Roman" w:hAnsi="Times New Roman"/>
+          <w:sz w:val="18"/>
+          <w:szCs w:val="18"/>
+          <w:lang w:val="es-EC"/>
+        </w:rPr>
+        <w:t xml:space="preserve"> </w:t>
+      </w:r>
+      <w:r>
+        <w:rPr>
+          <w:rFonts w:ascii="Times New Roman" w:hAnsi="Times New Roman"/>
+          <w:sz w:val="18"/>
+          <w:szCs w:val="18"/>
+          <w:lang w:val="es-EC"/>
+        </w:rPr>
+        <w:t>1802102101</w:t>
       </w:r>
       <w:r>
         <w:rPr>
@@ -2106,7 +2130,6 @@
         </w:rPr>
         <w:tab/>
       </w:r>
-      <w:proofErr w:type="gramStart"/>
       <w:r>
         <w:rPr>
           <w:rFonts w:ascii="Times New Roman" w:hAnsi="Times New Roman"/>
@@ -2124,26 +2147,7 @@
           <w:szCs w:val="18"/>
           <w:lang w:val="es-EC"/>
         </w:rPr>
-        <w:t>_</w:t>
-      </w:r>
-      <w:proofErr w:type="gramEnd"/>
-      <w:r>
-        <w:rPr>
-          <w:rFonts w:ascii="Times New Roman" w:hAnsi="Times New Roman"/>
-          <w:sz w:val="18"/>
-          <w:szCs w:val="18"/>
-          <w:lang w:val="es-EC"/>
-        </w:rPr>
-        <w:t>_______________________________</w:t>
-      </w:r>
-      <w:r>
-        <w:rPr>
-          <w:rFonts w:ascii="Times New Roman" w:hAnsi="Times New Roman"/>
-          <w:sz w:val="18"/>
-          <w:szCs w:val="18"/>
-          <w:lang w:val="es-EC"/>
-        </w:rPr>
-        <w:t>_____</w:t>
+        <w:t xml:space="preserve"> L00007077</w:t>
       </w:r>
     </w:p>
     <w:p>
@@ -2155,6 +2159,7 @@
         <w:rPr>
           <w:rFonts w:ascii="Times New Roman" w:hAnsi="Times New Roman"/>
           <w:b/>
+          <w:iCs/>
           <w:sz w:val="18"/>
           <w:szCs w:val="18"/>
           <w:lang w:val="es-EC"/>
@@ -2177,7 +2182,16 @@
           <w:szCs w:val="18"/>
           <w:lang w:val="es-EC"/>
         </w:rPr>
-        <w:t xml:space="preserve"> ___________________________________</w:t>
+        <w:t xml:space="preserve"> </w:t>
+      </w:r>
+      <w:r>
+        <w:rPr>
+          <w:rFonts w:ascii="Times New Roman" w:hAnsi="Times New Roman"/>
+          <w:sz w:val="18"/>
+          <w:szCs w:val="18"/>
+          <w:lang w:val="es-EC"/>
+        </w:rPr>
+        <w:t>0985313365</w:t>
       </w:r>
       <w:r>
         <w:rPr>
@@ -2196,25 +2210,17 @@
           <w:szCs w:val="18"/>
           <w:lang w:val="es-EC"/>
         </w:rPr>
-        <w:t>E- Mail: _</w:t>
-      </w:r>
-      <w:r>
-        <w:rPr>
-          <w:rFonts w:ascii="Times New Roman" w:hAnsi="Times New Roman"/>
-          <w:sz w:val="18"/>
-          <w:szCs w:val="18"/>
-          <w:lang w:val="es-EC"/>
-        </w:rPr>
-        <w:t>___________________________</w:t>
-      </w:r>
-      <w:r>
-        <w:rPr>
-          <w:rFonts w:ascii="Times New Roman" w:hAnsi="Times New Roman"/>
-          <w:sz w:val="18"/>
-          <w:szCs w:val="18"/>
-          <w:lang w:val="es-EC"/>
-        </w:rPr>
-        <w:t>_____</w:t>
+        <w:t xml:space="preserve">E- Mail: </w:t>
+      </w:r>
+      <w:r>
+        <w:rPr>
+          <w:rFonts w:ascii="Times New Roman" w:hAnsi="Times New Roman"/>
+          <w:iCs/>
+          <w:sz w:val="18"/>
+          <w:szCs w:val="18"/>
+          <w:lang w:val="es-EC"/>
+        </w:rPr>
+        <w:t>jaruiz@espe.edu.ec</w:t>
       </w:r>
     </w:p>
     <w:p>
@@ -3783,27 +3789,7 @@
                 <w:szCs w:val="18"/>
                 <w:lang w:val="es-EC"/>
               </w:rPr>
-              <w:t>Introducción</w:t>
-            </w:r>
-            <w:r>
-              <w:rPr>
-                <w:rFonts w:ascii="Times New Roman" w:hAnsi="Times New Roman"/>
-                <w:bCs/>
-                <w:sz w:val="18"/>
-                <w:szCs w:val="18"/>
-                <w:lang w:val="es-EC"/>
-              </w:rPr>
-              <w:t xml:space="preserve"> </w:t>
-            </w:r>
-            <w:r>
-              <w:rPr>
-                <w:rFonts w:ascii="Times New Roman" w:hAnsi="Times New Roman"/>
-                <w:bCs/>
-                <w:sz w:val="18"/>
-                <w:szCs w:val="18"/>
-                <w:lang w:val="es-EC"/>
-              </w:rPr>
-              <w:t>de la plataforma de firmas electrónica</w:t>
+              <w:t>Introducción al proyecto y a la empresa</w:t>
             </w:r>
           </w:p>
         </w:tc>
@@ -3888,7 +3874,7 @@
                 <w:szCs w:val="18"/>
                 <w:lang w:val="es-EC"/>
               </w:rPr>
-              <w:t>Investigación de agentes de IA</w:t>
+              <w:t>Investigación del problema y contexto sobre el portal de firmas y la inclusión del chatbot</w:t>
             </w:r>
           </w:p>
         </w:tc>
@@ -3973,7 +3959,7 @@
                 <w:szCs w:val="18"/>
                 <w:lang w:val="es-EC"/>
               </w:rPr>
-              <w:t>Investigación del agente de IA Ollama</w:t>
+              <w:t>Levantamiento de requerimientos del chatbot “Martina”</w:t>
             </w:r>
           </w:p>
         </w:tc>
@@ -4058,17 +4044,7 @@
                 <w:szCs w:val="18"/>
                 <w:lang w:val="es-EC"/>
               </w:rPr>
-              <w:t>Investi</w:t>
-            </w:r>
-            <w:r>
-              <w:rPr>
-                <w:rFonts w:ascii="Times New Roman" w:hAnsi="Times New Roman"/>
-                <w:bCs/>
-                <w:sz w:val="18"/>
-                <w:szCs w:val="18"/>
-                <w:lang w:val="es-EC"/>
-              </w:rPr>
-              <w:t>gación del agente de IA Gemini</w:t>
+              <w:t>Recepción de requerimientos para el chatbot “Martina”</w:t>
             </w:r>
           </w:p>
         </w:tc>
@@ -4163,17 +4139,7 @@
                 <w:szCs w:val="18"/>
                 <w:lang w:val="es-EC"/>
               </w:rPr>
-              <w:t xml:space="preserve">Investigación del agente de IA </w:t>
-            </w:r>
-            <w:r>
-              <w:rPr>
-                <w:rFonts w:ascii="Times New Roman" w:hAnsi="Times New Roman"/>
-                <w:bCs/>
-                <w:sz w:val="18"/>
-                <w:szCs w:val="18"/>
-                <w:lang w:val="es-EC"/>
-              </w:rPr>
-              <w:t>DeepSeek</w:t>
+              <w:t>Validación y análisis de funcionalidades para el chatbot “Martina”</w:t>
             </w:r>
           </w:p>
         </w:tc>
@@ -4258,27 +4224,7 @@
                 <w:szCs w:val="18"/>
                 <w:lang w:val="es-EC"/>
               </w:rPr>
-              <w:t>Investigación</w:t>
-            </w:r>
-            <w:r>
-              <w:rPr>
-                <w:rFonts w:ascii="Times New Roman" w:hAnsi="Times New Roman"/>
-                <w:bCs/>
-                <w:sz w:val="18"/>
-                <w:szCs w:val="18"/>
-                <w:lang w:val="es-EC"/>
-              </w:rPr>
-              <w:t xml:space="preserve"> </w:t>
-            </w:r>
-            <w:r>
-              <w:rPr>
-                <w:rFonts w:ascii="Times New Roman" w:hAnsi="Times New Roman"/>
-                <w:bCs/>
-                <w:sz w:val="18"/>
-                <w:szCs w:val="18"/>
-                <w:lang w:val="es-EC"/>
-              </w:rPr>
-              <w:t>del agente de IA Open AI</w:t>
+              <w:t>Validación y análisis de funcionalidades para el chatbot “Martina”</w:t>
             </w:r>
           </w:p>
         </w:tc>
@@ -4363,7 +4309,7 @@
                 <w:szCs w:val="18"/>
                 <w:lang w:val="es-EC"/>
               </w:rPr>
-              <w:t>Desarrollo del workflow RAG</w:t>
+              <w:t>Capacitación de la implementación del servidor de prueba y evaluación de tecnologías a usar</w:t>
             </w:r>
           </w:p>
         </w:tc>
@@ -4448,17 +4394,7 @@
                 <w:szCs w:val="18"/>
                 <w:lang w:val="es-EC"/>
               </w:rPr>
-              <w:t xml:space="preserve">Desarrollo del workflow </w:t>
-            </w:r>
-            <w:r>
-              <w:rPr>
-                <w:rFonts w:ascii="Times New Roman" w:hAnsi="Times New Roman"/>
-                <w:bCs/>
-                <w:sz w:val="18"/>
-                <w:szCs w:val="18"/>
-                <w:lang w:val="es-EC"/>
-              </w:rPr>
-              <w:t>para extracción de información con OCR</w:t>
+              <w:t>Pruebas de workflows dentro de N8N</w:t>
             </w:r>
           </w:p>
         </w:tc>
@@ -4543,17 +4479,7 @@
                 <w:szCs w:val="18"/>
                 <w:lang w:val="es-EC"/>
               </w:rPr>
-              <w:t>Desarrollo del workflow para chat de Telegra</w:t>
-            </w:r>
-            <w:r>
-              <w:rPr>
-                <w:rFonts w:ascii="Times New Roman" w:hAnsi="Times New Roman"/>
-                <w:bCs/>
-                <w:sz w:val="18"/>
-                <w:szCs w:val="18"/>
-                <w:lang w:val="es-EC"/>
-              </w:rPr>
-              <w:t>m</w:t>
+              <w:t>Diseño de arquitectura general para el chatbot</w:t>
             </w:r>
           </w:p>
         </w:tc>
@@ -4638,27 +4564,2958 @@
                 <w:szCs w:val="18"/>
                 <w:lang w:val="es-EC"/>
               </w:rPr>
-              <w:t>Desarrollo del wo</w:t>
-            </w:r>
-            <w:r>
-              <w:rPr>
-                <w:rFonts w:ascii="Times New Roman" w:hAnsi="Times New Roman"/>
-                <w:bCs/>
-                <w:sz w:val="18"/>
-                <w:szCs w:val="18"/>
-                <w:lang w:val="es-EC"/>
-              </w:rPr>
-              <w:t>rk</w:t>
-            </w:r>
-            <w:r>
-              <w:rPr>
-                <w:rFonts w:ascii="Times New Roman" w:hAnsi="Times New Roman"/>
-                <w:bCs/>
-                <w:sz w:val="18"/>
-                <w:szCs w:val="18"/>
-                <w:lang w:val="es-EC"/>
-              </w:rPr>
-              <w:t>flow para respuesta Cliente - Asesor</w:t>
+              <w:t>Pruebas de respuesta y consumo de tokens con Ollama</w:t>
+            </w:r>
+          </w:p>
+        </w:tc>
+      </w:tr>
+      <w:tr>
+        <w:tc>
+          <w:tcPr>
+            <w:tcW w:w="414" w:type="pct"/>
+            <w:vAlign w:val="center"/>
+          </w:tcPr>
+          <w:p>
+            <w:pPr>
+              <w:pStyle w:val="Default"/>
+              <w:jc w:val="center"/>
+              <w:rPr>
+                <w:color w:val="auto"/>
+                <w:sz w:val="18"/>
+                <w:szCs w:val="18"/>
+                <w:lang w:val="es-EC"/>
+              </w:rPr>
+            </w:pPr>
+            <w:r>
+              <w:rPr>
+                <w:color w:val="auto"/>
+                <w:sz w:val="18"/>
+                <w:szCs w:val="18"/>
+                <w:lang w:val="es-EC"/>
+              </w:rPr>
+              <w:t>11.</w:t>
+            </w:r>
+          </w:p>
+        </w:tc>
+        <w:tc>
+          <w:tcPr>
+            <w:tcW w:w="1102" w:type="pct"/>
+          </w:tcPr>
+          <w:p>
+            <w:pPr>
+              <w:pStyle w:val="BodyText"/>
+              <w:jc w:val="left"/>
+              <w:rPr>
+                <w:rFonts w:ascii="Times New Roman" w:hAnsi="Times New Roman"/>
+                <w:bCs/>
+                <w:sz w:val="18"/>
+                <w:szCs w:val="18"/>
+                <w:lang w:val="es-EC"/>
+              </w:rPr>
+            </w:pPr>
+            <w:r>
+              <w:rPr>
+                <w:rFonts w:ascii="Times New Roman" w:hAnsi="Times New Roman"/>
+                <w:bCs/>
+                <w:sz w:val="18"/>
+                <w:szCs w:val="18"/>
+                <w:lang w:val="es-EC"/>
+              </w:rPr>
+              <w:t>Desarrollo</w:t>
+            </w:r>
+          </w:p>
+        </w:tc>
+        <w:tc>
+          <w:tcPr>
+            <w:tcW w:w="3484" w:type="pct"/>
+          </w:tcPr>
+          <w:p>
+            <w:pPr>
+              <w:pStyle w:val="BodyText"/>
+              <w:jc w:val="left"/>
+              <w:rPr>
+                <w:rFonts w:ascii="Times New Roman" w:hAnsi="Times New Roman"/>
+                <w:bCs/>
+                <w:sz w:val="18"/>
+                <w:szCs w:val="18"/>
+                <w:lang w:val="es-EC"/>
+              </w:rPr>
+            </w:pPr>
+            <w:r>
+              <w:rPr>
+                <w:rFonts w:ascii="Times New Roman" w:hAnsi="Times New Roman"/>
+                <w:bCs/>
+                <w:sz w:val="18"/>
+                <w:szCs w:val="18"/>
+                <w:lang w:val="es-EC"/>
+              </w:rPr>
+              <w:t>Evaluación</w:t>
+            </w:r>
+            <w:r>
+              <w:rPr>
+                <w:rFonts w:ascii="Times New Roman" w:hAnsi="Times New Roman"/>
+                <w:bCs/>
+                <w:sz w:val="18"/>
+                <w:szCs w:val="18"/>
+                <w:lang w:val="es-EC"/>
+              </w:rPr>
+              <w:t xml:space="preserve"> de costos y consumo de tokens con Gemini</w:t>
+            </w:r>
+          </w:p>
+        </w:tc>
+      </w:tr>
+      <w:tr>
+        <w:tc>
+          <w:tcPr>
+            <w:tcW w:w="414" w:type="pct"/>
+            <w:vAlign w:val="center"/>
+          </w:tcPr>
+          <w:p>
+            <w:pPr>
+              <w:pStyle w:val="Default"/>
+              <w:jc w:val="center"/>
+              <w:rPr>
+                <w:color w:val="auto"/>
+                <w:sz w:val="18"/>
+                <w:szCs w:val="18"/>
+                <w:lang w:val="es-EC"/>
+              </w:rPr>
+            </w:pPr>
+            <w:r>
+              <w:rPr>
+                <w:color w:val="auto"/>
+                <w:sz w:val="18"/>
+                <w:szCs w:val="18"/>
+                <w:lang w:val="es-EC"/>
+              </w:rPr>
+              <w:t>12.</w:t>
+            </w:r>
+          </w:p>
+        </w:tc>
+        <w:tc>
+          <w:tcPr>
+            <w:tcW w:w="1102" w:type="pct"/>
+          </w:tcPr>
+          <w:p>
+            <w:pPr>
+              <w:pStyle w:val="BodyText"/>
+              <w:jc w:val="left"/>
+              <w:rPr>
+                <w:rFonts w:ascii="Times New Roman" w:hAnsi="Times New Roman"/>
+                <w:bCs/>
+                <w:sz w:val="18"/>
+                <w:szCs w:val="18"/>
+                <w:lang w:val="es-EC"/>
+              </w:rPr>
+            </w:pPr>
+            <w:r>
+              <w:rPr>
+                <w:rFonts w:ascii="Times New Roman" w:hAnsi="Times New Roman"/>
+                <w:bCs/>
+                <w:sz w:val="18"/>
+                <w:szCs w:val="18"/>
+                <w:lang w:val="es-EC"/>
+              </w:rPr>
+              <w:t>Desarrollo</w:t>
+            </w:r>
+          </w:p>
+        </w:tc>
+        <w:tc>
+          <w:tcPr>
+            <w:tcW w:w="3484" w:type="pct"/>
+          </w:tcPr>
+          <w:p>
+            <w:pPr>
+              <w:pStyle w:val="BodyText"/>
+              <w:jc w:val="left"/>
+              <w:rPr>
+                <w:rFonts w:ascii="Times New Roman" w:hAnsi="Times New Roman"/>
+                <w:bCs/>
+                <w:sz w:val="18"/>
+                <w:szCs w:val="18"/>
+                <w:lang w:val="es-EC"/>
+              </w:rPr>
+            </w:pPr>
+            <w:r>
+              <w:rPr>
+                <w:rFonts w:ascii="Times New Roman" w:hAnsi="Times New Roman"/>
+                <w:bCs/>
+                <w:sz w:val="18"/>
+                <w:szCs w:val="18"/>
+                <w:lang w:val="es-EC"/>
+              </w:rPr>
+              <w:t>Pruebas de embedding usando modelos de DeepSeek</w:t>
+            </w:r>
+          </w:p>
+        </w:tc>
+      </w:tr>
+      <w:tr>
+        <w:tc>
+          <w:tcPr>
+            <w:tcW w:w="414" w:type="pct"/>
+            <w:vAlign w:val="center"/>
+          </w:tcPr>
+          <w:p>
+            <w:pPr>
+              <w:pStyle w:val="Default"/>
+              <w:jc w:val="center"/>
+              <w:rPr>
+                <w:color w:val="auto"/>
+                <w:sz w:val="18"/>
+                <w:szCs w:val="18"/>
+                <w:lang w:val="es-EC"/>
+              </w:rPr>
+            </w:pPr>
+            <w:r>
+              <w:rPr>
+                <w:color w:val="auto"/>
+                <w:sz w:val="18"/>
+                <w:szCs w:val="18"/>
+                <w:lang w:val="es-EC"/>
+              </w:rPr>
+              <w:t>13.</w:t>
+            </w:r>
+          </w:p>
+        </w:tc>
+        <w:tc>
+          <w:tcPr>
+            <w:tcW w:w="1102" w:type="pct"/>
+          </w:tcPr>
+          <w:p>
+            <w:pPr>
+              <w:pStyle w:val="BodyText"/>
+              <w:jc w:val="left"/>
+              <w:rPr>
+                <w:rFonts w:ascii="Times New Roman" w:hAnsi="Times New Roman"/>
+                <w:bCs/>
+                <w:sz w:val="18"/>
+                <w:szCs w:val="18"/>
+                <w:lang w:val="es-EC"/>
+              </w:rPr>
+            </w:pPr>
+            <w:r>
+              <w:rPr>
+                <w:rFonts w:ascii="Times New Roman" w:hAnsi="Times New Roman"/>
+                <w:bCs/>
+                <w:sz w:val="18"/>
+                <w:szCs w:val="18"/>
+                <w:lang w:val="es-EC"/>
+              </w:rPr>
+              <w:t>Desarrollo</w:t>
+            </w:r>
+          </w:p>
+        </w:tc>
+        <w:tc>
+          <w:tcPr>
+            <w:tcW w:w="3484" w:type="pct"/>
+          </w:tcPr>
+          <w:p>
+            <w:pPr>
+              <w:pStyle w:val="BodyText"/>
+              <w:jc w:val="left"/>
+              <w:rPr>
+                <w:rFonts w:ascii="Times New Roman" w:hAnsi="Times New Roman"/>
+                <w:bCs/>
+                <w:sz w:val="18"/>
+                <w:szCs w:val="18"/>
+                <w:lang w:val="es-EC"/>
+              </w:rPr>
+            </w:pPr>
+            <w:r>
+              <w:rPr>
+                <w:rFonts w:ascii="Times New Roman" w:hAnsi="Times New Roman"/>
+                <w:bCs/>
+                <w:sz w:val="18"/>
+                <w:szCs w:val="18"/>
+                <w:lang w:val="es-EC"/>
+              </w:rPr>
+              <w:t>Pruebas dentro del servidor de AWS</w:t>
+            </w:r>
+          </w:p>
+        </w:tc>
+      </w:tr>
+      <w:tr>
+        <w:tc>
+          <w:tcPr>
+            <w:tcW w:w="414" w:type="pct"/>
+            <w:vAlign w:val="center"/>
+          </w:tcPr>
+          <w:p>
+            <w:pPr>
+              <w:pStyle w:val="Default"/>
+              <w:jc w:val="center"/>
+              <w:rPr>
+                <w:color w:val="auto"/>
+                <w:sz w:val="18"/>
+                <w:szCs w:val="18"/>
+                <w:lang w:val="es-EC"/>
+              </w:rPr>
+            </w:pPr>
+            <w:r>
+              <w:rPr>
+                <w:color w:val="auto"/>
+                <w:sz w:val="18"/>
+                <w:szCs w:val="18"/>
+                <w:lang w:val="es-EC"/>
+              </w:rPr>
+              <w:t>14.</w:t>
+            </w:r>
+          </w:p>
+        </w:tc>
+        <w:tc>
+          <w:tcPr>
+            <w:tcW w:w="1102" w:type="pct"/>
+          </w:tcPr>
+          <w:p>
+            <w:pPr>
+              <w:pStyle w:val="BodyText"/>
+              <w:jc w:val="left"/>
+              <w:rPr>
+                <w:rFonts w:ascii="Times New Roman" w:hAnsi="Times New Roman"/>
+                <w:bCs/>
+                <w:sz w:val="18"/>
+                <w:szCs w:val="18"/>
+                <w:lang w:val="es-EC"/>
+              </w:rPr>
+            </w:pPr>
+            <w:r>
+              <w:rPr>
+                <w:rFonts w:ascii="Times New Roman" w:hAnsi="Times New Roman"/>
+                <w:bCs/>
+                <w:sz w:val="18"/>
+                <w:szCs w:val="18"/>
+                <w:lang w:val="es-EC"/>
+              </w:rPr>
+              <w:t>Desarrollo</w:t>
+            </w:r>
+          </w:p>
+        </w:tc>
+        <w:tc>
+          <w:tcPr>
+            <w:tcW w:w="3484" w:type="pct"/>
+          </w:tcPr>
+          <w:p>
+            <w:pPr>
+              <w:pStyle w:val="BodyText"/>
+              <w:jc w:val="left"/>
+              <w:rPr>
+                <w:rFonts w:ascii="Times New Roman" w:hAnsi="Times New Roman"/>
+                <w:bCs/>
+                <w:sz w:val="18"/>
+                <w:szCs w:val="18"/>
+                <w:lang w:val="es-EC"/>
+              </w:rPr>
+            </w:pPr>
+            <w:r>
+              <w:rPr>
+                <w:rFonts w:ascii="Times New Roman" w:hAnsi="Times New Roman"/>
+                <w:bCs/>
+                <w:sz w:val="18"/>
+                <w:szCs w:val="18"/>
+                <w:lang w:val="es-EC"/>
+              </w:rPr>
+              <w:t>Investigación y diseño de la primera arquitectura para el chatbot y la base de datos</w:t>
+            </w:r>
+          </w:p>
+        </w:tc>
+      </w:tr>
+      <w:tr>
+        <w:tc>
+          <w:tcPr>
+            <w:tcW w:w="414" w:type="pct"/>
+            <w:vAlign w:val="center"/>
+          </w:tcPr>
+          <w:p>
+            <w:pPr>
+              <w:pStyle w:val="Default"/>
+              <w:jc w:val="center"/>
+              <w:rPr>
+                <w:color w:val="auto"/>
+                <w:sz w:val="18"/>
+                <w:szCs w:val="18"/>
+                <w:lang w:val="es-EC"/>
+              </w:rPr>
+            </w:pPr>
+            <w:r>
+              <w:rPr>
+                <w:color w:val="auto"/>
+                <w:sz w:val="18"/>
+                <w:szCs w:val="18"/>
+                <w:lang w:val="es-EC"/>
+              </w:rPr>
+              <w:t>15.</w:t>
+            </w:r>
+          </w:p>
+        </w:tc>
+        <w:tc>
+          <w:tcPr>
+            <w:tcW w:w="1102" w:type="pct"/>
+          </w:tcPr>
+          <w:p>
+            <w:pPr>
+              <w:pStyle w:val="BodyText"/>
+              <w:jc w:val="left"/>
+              <w:rPr>
+                <w:rFonts w:ascii="Times New Roman" w:hAnsi="Times New Roman"/>
+                <w:bCs/>
+                <w:sz w:val="18"/>
+                <w:szCs w:val="18"/>
+                <w:lang w:val="es-EC"/>
+              </w:rPr>
+            </w:pPr>
+            <w:r>
+              <w:rPr>
+                <w:rFonts w:ascii="Times New Roman" w:hAnsi="Times New Roman"/>
+                <w:bCs/>
+                <w:sz w:val="18"/>
+                <w:szCs w:val="18"/>
+                <w:lang w:val="es-EC"/>
+              </w:rPr>
+              <w:t>Desarrollo</w:t>
+            </w:r>
+          </w:p>
+        </w:tc>
+        <w:tc>
+          <w:tcPr>
+            <w:tcW w:w="3484" w:type="pct"/>
+          </w:tcPr>
+          <w:p>
+            <w:pPr>
+              <w:pStyle w:val="BodyText"/>
+              <w:jc w:val="left"/>
+              <w:rPr>
+                <w:rFonts w:ascii="Times New Roman" w:hAnsi="Times New Roman"/>
+                <w:bCs/>
+                <w:sz w:val="18"/>
+                <w:szCs w:val="18"/>
+                <w:lang w:val="es-EC"/>
+              </w:rPr>
+            </w:pPr>
+            <w:r>
+              <w:rPr>
+                <w:rFonts w:ascii="Times New Roman" w:hAnsi="Times New Roman"/>
+                <w:bCs/>
+                <w:sz w:val="18"/>
+                <w:szCs w:val="18"/>
+                <w:lang w:val="es-EC"/>
+              </w:rPr>
+              <w:t>Desarrollo de interacción usuario-bot</w:t>
+            </w:r>
+          </w:p>
+        </w:tc>
+      </w:tr>
+      <w:tr>
+        <w:tc>
+          <w:tcPr>
+            <w:tcW w:w="414" w:type="pct"/>
+            <w:vAlign w:val="center"/>
+          </w:tcPr>
+          <w:p>
+            <w:pPr>
+              <w:pStyle w:val="Default"/>
+              <w:jc w:val="center"/>
+              <w:rPr>
+                <w:color w:val="auto"/>
+                <w:sz w:val="18"/>
+                <w:szCs w:val="18"/>
+                <w:lang w:val="es-EC"/>
+              </w:rPr>
+            </w:pPr>
+            <w:r>
+              <w:rPr>
+                <w:color w:val="auto"/>
+                <w:sz w:val="18"/>
+                <w:szCs w:val="18"/>
+                <w:lang w:val="es-EC"/>
+              </w:rPr>
+              <w:t>16.</w:t>
+            </w:r>
+          </w:p>
+        </w:tc>
+        <w:tc>
+          <w:tcPr>
+            <w:tcW w:w="1102" w:type="pct"/>
+          </w:tcPr>
+          <w:p>
+            <w:pPr>
+              <w:pStyle w:val="BodyText"/>
+              <w:jc w:val="left"/>
+              <w:rPr>
+                <w:rFonts w:ascii="Times New Roman" w:hAnsi="Times New Roman"/>
+                <w:bCs/>
+                <w:sz w:val="18"/>
+                <w:szCs w:val="18"/>
+                <w:lang w:val="es-EC"/>
+              </w:rPr>
+            </w:pPr>
+            <w:r>
+              <w:rPr>
+                <w:rFonts w:ascii="Times New Roman" w:hAnsi="Times New Roman"/>
+                <w:bCs/>
+                <w:sz w:val="18"/>
+                <w:szCs w:val="18"/>
+                <w:lang w:val="es-EC"/>
+              </w:rPr>
+              <w:t xml:space="preserve">Desarrollo </w:t>
+            </w:r>
+          </w:p>
+        </w:tc>
+        <w:tc>
+          <w:tcPr>
+            <w:tcW w:w="3484" w:type="pct"/>
+          </w:tcPr>
+          <w:p>
+            <w:pPr>
+              <w:pStyle w:val="BodyText"/>
+              <w:jc w:val="left"/>
+              <w:rPr>
+                <w:rFonts w:ascii="Times New Roman" w:hAnsi="Times New Roman"/>
+                <w:bCs/>
+                <w:sz w:val="18"/>
+                <w:szCs w:val="18"/>
+                <w:lang w:val="es-EC"/>
+              </w:rPr>
+            </w:pPr>
+            <w:r>
+              <w:rPr>
+                <w:rFonts w:ascii="Times New Roman" w:hAnsi="Times New Roman"/>
+                <w:bCs/>
+                <w:sz w:val="18"/>
+                <w:szCs w:val="18"/>
+                <w:lang w:val="es-EC"/>
+              </w:rPr>
+              <w:t>Desarrollo del sistema RAG V-0.1</w:t>
+            </w:r>
+          </w:p>
+        </w:tc>
+      </w:tr>
+      <w:tr>
+        <w:tc>
+          <w:tcPr>
+            <w:tcW w:w="414" w:type="pct"/>
+            <w:vAlign w:val="center"/>
+          </w:tcPr>
+          <w:p>
+            <w:pPr>
+              <w:pStyle w:val="Default"/>
+              <w:jc w:val="center"/>
+              <w:rPr>
+                <w:color w:val="auto"/>
+                <w:sz w:val="18"/>
+                <w:szCs w:val="18"/>
+                <w:lang w:val="es-EC"/>
+              </w:rPr>
+            </w:pPr>
+            <w:r>
+              <w:rPr>
+                <w:color w:val="auto"/>
+                <w:sz w:val="18"/>
+                <w:szCs w:val="18"/>
+                <w:lang w:val="es-EC"/>
+              </w:rPr>
+              <w:t>17.</w:t>
+            </w:r>
+          </w:p>
+        </w:tc>
+        <w:tc>
+          <w:tcPr>
+            <w:tcW w:w="1102" w:type="pct"/>
+          </w:tcPr>
+          <w:p>
+            <w:pPr>
+              <w:pStyle w:val="BodyText"/>
+              <w:jc w:val="left"/>
+              <w:rPr>
+                <w:rFonts w:ascii="Times New Roman" w:hAnsi="Times New Roman"/>
+                <w:bCs/>
+                <w:sz w:val="18"/>
+                <w:szCs w:val="18"/>
+                <w:lang w:val="es-EC"/>
+              </w:rPr>
+            </w:pPr>
+            <w:r>
+              <w:rPr>
+                <w:rFonts w:ascii="Times New Roman" w:hAnsi="Times New Roman"/>
+                <w:bCs/>
+                <w:sz w:val="18"/>
+                <w:szCs w:val="18"/>
+                <w:lang w:val="es-EC"/>
+              </w:rPr>
+              <w:t>Desarrollo</w:t>
+            </w:r>
+          </w:p>
+        </w:tc>
+        <w:tc>
+          <w:tcPr>
+            <w:tcW w:w="3484" w:type="pct"/>
+          </w:tcPr>
+          <w:p>
+            <w:pPr>
+              <w:pStyle w:val="BodyText"/>
+              <w:jc w:val="left"/>
+              <w:rPr>
+                <w:rFonts w:ascii="Times New Roman" w:hAnsi="Times New Roman"/>
+                <w:bCs/>
+                <w:sz w:val="18"/>
+                <w:szCs w:val="18"/>
+                <w:lang w:val="es-EC"/>
+              </w:rPr>
+            </w:pPr>
+            <w:r>
+              <w:rPr>
+                <w:rFonts w:ascii="Times New Roman" w:hAnsi="Times New Roman"/>
+                <w:bCs/>
+                <w:sz w:val="18"/>
+                <w:szCs w:val="18"/>
+                <w:lang w:val="es-EC"/>
+              </w:rPr>
+              <w:t>Desarrollo del sistema RAG V-0.2</w:t>
+            </w:r>
+          </w:p>
+        </w:tc>
+      </w:tr>
+      <w:tr>
+        <w:tc>
+          <w:tcPr>
+            <w:tcW w:w="414" w:type="pct"/>
+            <w:vAlign w:val="center"/>
+          </w:tcPr>
+          <w:p>
+            <w:pPr>
+              <w:pStyle w:val="Default"/>
+              <w:jc w:val="center"/>
+              <w:rPr>
+                <w:color w:val="auto"/>
+                <w:sz w:val="18"/>
+                <w:szCs w:val="18"/>
+                <w:lang w:val="es-EC"/>
+              </w:rPr>
+            </w:pPr>
+            <w:r>
+              <w:rPr>
+                <w:color w:val="auto"/>
+                <w:sz w:val="18"/>
+                <w:szCs w:val="18"/>
+                <w:lang w:val="es-EC"/>
+              </w:rPr>
+              <w:t>18.</w:t>
+            </w:r>
+          </w:p>
+        </w:tc>
+        <w:tc>
+          <w:tcPr>
+            <w:tcW w:w="1102" w:type="pct"/>
+          </w:tcPr>
+          <w:p>
+            <w:pPr>
+              <w:pStyle w:val="BodyText"/>
+              <w:jc w:val="left"/>
+              <w:rPr>
+                <w:rFonts w:ascii="Times New Roman" w:hAnsi="Times New Roman"/>
+                <w:bCs/>
+                <w:sz w:val="18"/>
+                <w:szCs w:val="18"/>
+                <w:lang w:val="es-EC"/>
+              </w:rPr>
+            </w:pPr>
+            <w:r>
+              <w:rPr>
+                <w:rFonts w:ascii="Times New Roman" w:hAnsi="Times New Roman"/>
+                <w:bCs/>
+                <w:sz w:val="18"/>
+                <w:szCs w:val="18"/>
+                <w:lang w:val="es-EC"/>
+              </w:rPr>
+              <w:t>Desarrollo</w:t>
+            </w:r>
+          </w:p>
+        </w:tc>
+        <w:tc>
+          <w:tcPr>
+            <w:tcW w:w="3484" w:type="pct"/>
+          </w:tcPr>
+          <w:p>
+            <w:pPr>
+              <w:pStyle w:val="BodyText"/>
+              <w:jc w:val="left"/>
+              <w:rPr>
+                <w:rFonts w:ascii="Times New Roman" w:hAnsi="Times New Roman"/>
+                <w:bCs/>
+                <w:sz w:val="18"/>
+                <w:szCs w:val="18"/>
+                <w:lang w:val="es-EC"/>
+              </w:rPr>
+            </w:pPr>
+            <w:r>
+              <w:rPr>
+                <w:rFonts w:ascii="Times New Roman" w:hAnsi="Times New Roman"/>
+                <w:bCs/>
+                <w:sz w:val="18"/>
+                <w:szCs w:val="18"/>
+                <w:lang w:val="es-EC"/>
+              </w:rPr>
+              <w:t>Desarrollo del sistema RAG V-0.3</w:t>
+            </w:r>
+          </w:p>
+        </w:tc>
+      </w:tr>
+      <w:tr>
+        <w:tc>
+          <w:tcPr>
+            <w:tcW w:w="414" w:type="pct"/>
+            <w:vAlign w:val="center"/>
+          </w:tcPr>
+          <w:p>
+            <w:pPr>
+              <w:pStyle w:val="Default"/>
+              <w:jc w:val="center"/>
+              <w:rPr>
+                <w:color w:val="auto"/>
+                <w:sz w:val="18"/>
+                <w:szCs w:val="18"/>
+                <w:lang w:val="es-EC"/>
+              </w:rPr>
+            </w:pPr>
+            <w:r>
+              <w:rPr>
+                <w:color w:val="auto"/>
+                <w:sz w:val="18"/>
+                <w:szCs w:val="18"/>
+                <w:lang w:val="es-EC"/>
+              </w:rPr>
+              <w:t>19.</w:t>
+            </w:r>
+          </w:p>
+        </w:tc>
+        <w:tc>
+          <w:tcPr>
+            <w:tcW w:w="1102" w:type="pct"/>
+          </w:tcPr>
+          <w:p>
+            <w:pPr>
+              <w:pStyle w:val="BodyText"/>
+              <w:jc w:val="left"/>
+              <w:rPr>
+                <w:rFonts w:ascii="Times New Roman" w:hAnsi="Times New Roman"/>
+                <w:bCs/>
+                <w:sz w:val="18"/>
+                <w:szCs w:val="18"/>
+                <w:lang w:val="es-EC"/>
+              </w:rPr>
+            </w:pPr>
+            <w:r>
+              <w:rPr>
+                <w:rFonts w:ascii="Times New Roman" w:hAnsi="Times New Roman"/>
+                <w:bCs/>
+                <w:sz w:val="18"/>
+                <w:szCs w:val="18"/>
+                <w:lang w:val="es-EC"/>
+              </w:rPr>
+              <w:t>Desarrollo</w:t>
+            </w:r>
+          </w:p>
+        </w:tc>
+        <w:tc>
+          <w:tcPr>
+            <w:tcW w:w="3484" w:type="pct"/>
+          </w:tcPr>
+          <w:p>
+            <w:pPr>
+              <w:pStyle w:val="BodyText"/>
+              <w:jc w:val="left"/>
+              <w:rPr>
+                <w:rFonts w:ascii="Times New Roman" w:hAnsi="Times New Roman"/>
+                <w:bCs/>
+                <w:sz w:val="18"/>
+                <w:szCs w:val="18"/>
+                <w:lang w:val="es-EC"/>
+              </w:rPr>
+            </w:pPr>
+            <w:r>
+              <w:rPr>
+                <w:rFonts w:ascii="Times New Roman" w:hAnsi="Times New Roman"/>
+                <w:bCs/>
+                <w:sz w:val="18"/>
+                <w:szCs w:val="18"/>
+                <w:lang w:val="es-EC"/>
+              </w:rPr>
+              <w:t>Implementación final del sistema RAG e inicio del desarrollo del guardado del historial</w:t>
+            </w:r>
+          </w:p>
+        </w:tc>
+      </w:tr>
+      <w:tr>
+        <w:tc>
+          <w:tcPr>
+            <w:tcW w:w="414" w:type="pct"/>
+            <w:vAlign w:val="center"/>
+          </w:tcPr>
+          <w:p>
+            <w:pPr>
+              <w:pStyle w:val="Default"/>
+              <w:jc w:val="center"/>
+              <w:rPr>
+                <w:color w:val="auto"/>
+                <w:sz w:val="18"/>
+                <w:szCs w:val="18"/>
+                <w:lang w:val="es-EC"/>
+              </w:rPr>
+            </w:pPr>
+            <w:r>
+              <w:rPr>
+                <w:color w:val="auto"/>
+                <w:sz w:val="18"/>
+                <w:szCs w:val="18"/>
+                <w:lang w:val="es-EC"/>
+              </w:rPr>
+              <w:t>20.</w:t>
+            </w:r>
+          </w:p>
+        </w:tc>
+        <w:tc>
+          <w:tcPr>
+            <w:tcW w:w="1102" w:type="pct"/>
+          </w:tcPr>
+          <w:p>
+            <w:pPr>
+              <w:pStyle w:val="BodyText"/>
+              <w:jc w:val="left"/>
+              <w:rPr>
+                <w:rFonts w:ascii="Times New Roman" w:hAnsi="Times New Roman"/>
+                <w:bCs/>
+                <w:sz w:val="18"/>
+                <w:szCs w:val="18"/>
+                <w:lang w:val="es-EC"/>
+              </w:rPr>
+            </w:pPr>
+            <w:r>
+              <w:rPr>
+                <w:rFonts w:ascii="Times New Roman" w:hAnsi="Times New Roman"/>
+                <w:bCs/>
+                <w:sz w:val="18"/>
+                <w:szCs w:val="18"/>
+                <w:lang w:val="es-EC"/>
+              </w:rPr>
+              <w:t>Desarrollo</w:t>
+            </w:r>
+          </w:p>
+        </w:tc>
+        <w:tc>
+          <w:tcPr>
+            <w:tcW w:w="3484" w:type="pct"/>
+          </w:tcPr>
+          <w:p>
+            <w:pPr>
+              <w:pStyle w:val="BodyText"/>
+              <w:jc w:val="left"/>
+              <w:rPr>
+                <w:rFonts w:ascii="Times New Roman" w:hAnsi="Times New Roman"/>
+                <w:bCs/>
+                <w:sz w:val="18"/>
+                <w:szCs w:val="18"/>
+                <w:lang w:val="es-EC"/>
+              </w:rPr>
+            </w:pPr>
+            <w:r>
+              <w:rPr>
+                <w:rFonts w:ascii="Times New Roman" w:hAnsi="Times New Roman"/>
+                <w:bCs/>
+                <w:sz w:val="18"/>
+                <w:szCs w:val="18"/>
+                <w:lang w:val="es-EC"/>
+              </w:rPr>
+              <w:t>Prueba y corrección de almacenamiento de información en base al id del historial</w:t>
+            </w:r>
+          </w:p>
+        </w:tc>
+      </w:tr>
+      <w:tr>
+        <w:tc>
+          <w:tcPr>
+            <w:tcW w:w="414" w:type="pct"/>
+            <w:vAlign w:val="center"/>
+          </w:tcPr>
+          <w:p>
+            <w:pPr>
+              <w:pStyle w:val="Default"/>
+              <w:jc w:val="center"/>
+              <w:rPr>
+                <w:color w:val="auto"/>
+                <w:sz w:val="18"/>
+                <w:szCs w:val="18"/>
+                <w:lang w:val="es-EC"/>
+              </w:rPr>
+            </w:pPr>
+            <w:r>
+              <w:rPr>
+                <w:color w:val="auto"/>
+                <w:sz w:val="18"/>
+                <w:szCs w:val="18"/>
+                <w:lang w:val="es-EC"/>
+              </w:rPr>
+              <w:t>21.</w:t>
+            </w:r>
+          </w:p>
+        </w:tc>
+        <w:tc>
+          <w:tcPr>
+            <w:tcW w:w="1102" w:type="pct"/>
+          </w:tcPr>
+          <w:p>
+            <w:pPr>
+              <w:pStyle w:val="BodyText"/>
+              <w:jc w:val="left"/>
+              <w:rPr>
+                <w:rFonts w:ascii="Times New Roman" w:hAnsi="Times New Roman"/>
+                <w:bCs/>
+                <w:sz w:val="18"/>
+                <w:szCs w:val="18"/>
+                <w:lang w:val="es-EC"/>
+              </w:rPr>
+            </w:pPr>
+            <w:r>
+              <w:rPr>
+                <w:rFonts w:ascii="Times New Roman" w:hAnsi="Times New Roman"/>
+                <w:bCs/>
+                <w:sz w:val="18"/>
+                <w:szCs w:val="18"/>
+                <w:lang w:val="es-EC"/>
+              </w:rPr>
+              <w:t>Desarrollo</w:t>
+            </w:r>
+          </w:p>
+        </w:tc>
+        <w:tc>
+          <w:tcPr>
+            <w:tcW w:w="3484" w:type="pct"/>
+          </w:tcPr>
+          <w:p>
+            <w:pPr>
+              <w:pStyle w:val="BodyText"/>
+              <w:jc w:val="left"/>
+              <w:rPr>
+                <w:rFonts w:ascii="Times New Roman" w:hAnsi="Times New Roman"/>
+                <w:bCs/>
+                <w:sz w:val="18"/>
+                <w:szCs w:val="18"/>
+                <w:lang w:val="es-EC"/>
+              </w:rPr>
+            </w:pPr>
+            <w:r>
+              <w:rPr>
+                <w:rFonts w:ascii="Times New Roman" w:hAnsi="Times New Roman"/>
+                <w:bCs/>
+                <w:sz w:val="18"/>
+                <w:szCs w:val="18"/>
+                <w:lang w:val="es-EC"/>
+              </w:rPr>
+              <w:t xml:space="preserve">Desarrollo de extracción de información </w:t>
+            </w:r>
+            <w:r>
+              <w:rPr>
+                <w:rFonts w:ascii="Times New Roman" w:hAnsi="Times New Roman"/>
+                <w:bCs/>
+                <w:sz w:val="18"/>
+                <w:szCs w:val="18"/>
+                <w:lang w:val="es-EC"/>
+              </w:rPr>
+              <w:t>de cédulas mediante OCR V-0.1</w:t>
+            </w:r>
+          </w:p>
+        </w:tc>
+      </w:tr>
+      <w:tr>
+        <w:tc>
+          <w:tcPr>
+            <w:tcW w:w="414" w:type="pct"/>
+            <w:vAlign w:val="center"/>
+          </w:tcPr>
+          <w:p>
+            <w:pPr>
+              <w:pStyle w:val="Default"/>
+              <w:jc w:val="center"/>
+              <w:rPr>
+                <w:color w:val="auto"/>
+                <w:sz w:val="18"/>
+                <w:szCs w:val="18"/>
+                <w:lang w:val="es-EC"/>
+              </w:rPr>
+            </w:pPr>
+            <w:r>
+              <w:rPr>
+                <w:color w:val="auto"/>
+                <w:sz w:val="18"/>
+                <w:szCs w:val="18"/>
+                <w:lang w:val="es-EC"/>
+              </w:rPr>
+              <w:t>22.</w:t>
+            </w:r>
+          </w:p>
+        </w:tc>
+        <w:tc>
+          <w:tcPr>
+            <w:tcW w:w="1102" w:type="pct"/>
+          </w:tcPr>
+          <w:p>
+            <w:pPr>
+              <w:pStyle w:val="BodyText"/>
+              <w:jc w:val="left"/>
+              <w:rPr>
+                <w:rFonts w:ascii="Times New Roman" w:hAnsi="Times New Roman"/>
+                <w:bCs/>
+                <w:sz w:val="18"/>
+                <w:szCs w:val="18"/>
+                <w:lang w:val="es-EC"/>
+              </w:rPr>
+            </w:pPr>
+            <w:r>
+              <w:rPr>
+                <w:rFonts w:ascii="Times New Roman" w:hAnsi="Times New Roman"/>
+                <w:bCs/>
+                <w:sz w:val="18"/>
+                <w:szCs w:val="18"/>
+                <w:lang w:val="es-EC"/>
+              </w:rPr>
+              <w:t>Desarrollo</w:t>
+            </w:r>
+          </w:p>
+        </w:tc>
+        <w:tc>
+          <w:tcPr>
+            <w:tcW w:w="3484" w:type="pct"/>
+          </w:tcPr>
+          <w:p>
+            <w:pPr>
+              <w:pStyle w:val="BodyText"/>
+              <w:jc w:val="left"/>
+              <w:rPr>
+                <w:rFonts w:ascii="Times New Roman" w:hAnsi="Times New Roman"/>
+                <w:bCs/>
+                <w:sz w:val="18"/>
+                <w:szCs w:val="18"/>
+                <w:lang w:val="es-EC"/>
+              </w:rPr>
+            </w:pPr>
+            <w:r>
+              <w:rPr>
+                <w:rFonts w:ascii="Times New Roman" w:hAnsi="Times New Roman"/>
+                <w:bCs/>
+                <w:sz w:val="18"/>
+                <w:szCs w:val="18"/>
+                <w:lang w:val="es-EC"/>
+              </w:rPr>
+              <w:t xml:space="preserve">Actualización de extracción </w:t>
+            </w:r>
+            <w:r>
+              <w:rPr>
+                <w:rFonts w:ascii="Times New Roman" w:hAnsi="Times New Roman"/>
+                <w:bCs/>
+                <w:sz w:val="18"/>
+                <w:szCs w:val="18"/>
+                <w:lang w:val="es-EC"/>
+              </w:rPr>
+              <w:t>de información mediante OCR V-0.2</w:t>
+            </w:r>
+          </w:p>
+        </w:tc>
+      </w:tr>
+      <w:tr>
+        <w:tc>
+          <w:tcPr>
+            <w:tcW w:w="414" w:type="pct"/>
+            <w:vAlign w:val="center"/>
+          </w:tcPr>
+          <w:p>
+            <w:pPr>
+              <w:pStyle w:val="Default"/>
+              <w:jc w:val="center"/>
+              <w:rPr>
+                <w:color w:val="auto"/>
+                <w:sz w:val="18"/>
+                <w:szCs w:val="18"/>
+                <w:lang w:val="es-EC"/>
+              </w:rPr>
+            </w:pPr>
+            <w:r>
+              <w:rPr>
+                <w:color w:val="auto"/>
+                <w:sz w:val="18"/>
+                <w:szCs w:val="18"/>
+                <w:lang w:val="es-EC"/>
+              </w:rPr>
+              <w:t>23.</w:t>
+            </w:r>
+          </w:p>
+        </w:tc>
+        <w:tc>
+          <w:tcPr>
+            <w:tcW w:w="1102" w:type="pct"/>
+          </w:tcPr>
+          <w:p>
+            <w:pPr>
+              <w:pStyle w:val="BodyText"/>
+              <w:jc w:val="left"/>
+              <w:rPr>
+                <w:rFonts w:ascii="Times New Roman" w:hAnsi="Times New Roman"/>
+                <w:bCs/>
+                <w:sz w:val="18"/>
+                <w:szCs w:val="18"/>
+                <w:lang w:val="es-EC"/>
+              </w:rPr>
+            </w:pPr>
+            <w:r>
+              <w:rPr>
+                <w:rFonts w:ascii="Times New Roman" w:hAnsi="Times New Roman"/>
+                <w:bCs/>
+                <w:sz w:val="18"/>
+                <w:szCs w:val="18"/>
+                <w:lang w:val="es-EC"/>
+              </w:rPr>
+              <w:t>Desarrollo</w:t>
+            </w:r>
+          </w:p>
+        </w:tc>
+        <w:tc>
+          <w:tcPr>
+            <w:tcW w:w="3484" w:type="pct"/>
+          </w:tcPr>
+          <w:p>
+            <w:pPr>
+              <w:pStyle w:val="BodyText"/>
+              <w:jc w:val="left"/>
+              <w:rPr>
+                <w:rFonts w:ascii="Times New Roman" w:hAnsi="Times New Roman"/>
+                <w:bCs/>
+                <w:sz w:val="18"/>
+                <w:szCs w:val="18"/>
+                <w:lang w:val="es-EC"/>
+              </w:rPr>
+            </w:pPr>
+            <w:r>
+              <w:rPr>
+                <w:rFonts w:ascii="Times New Roman" w:hAnsi="Times New Roman"/>
+                <w:bCs/>
+                <w:sz w:val="18"/>
+                <w:szCs w:val="18"/>
+                <w:lang w:val="es-EC"/>
+              </w:rPr>
+              <w:t>Actualización final del workflow de extracción con OCR V-0.3</w:t>
+            </w:r>
+          </w:p>
+        </w:tc>
+      </w:tr>
+      <w:tr>
+        <w:tc>
+          <w:tcPr>
+            <w:tcW w:w="414" w:type="pct"/>
+            <w:vAlign w:val="center"/>
+          </w:tcPr>
+          <w:p>
+            <w:pPr>
+              <w:pStyle w:val="Default"/>
+              <w:jc w:val="center"/>
+              <w:rPr>
+                <w:color w:val="auto"/>
+                <w:sz w:val="18"/>
+                <w:szCs w:val="18"/>
+                <w:lang w:val="es-EC"/>
+              </w:rPr>
+            </w:pPr>
+            <w:r>
+              <w:rPr>
+                <w:color w:val="auto"/>
+                <w:sz w:val="18"/>
+                <w:szCs w:val="18"/>
+                <w:lang w:val="es-EC"/>
+              </w:rPr>
+              <w:t>24.</w:t>
+            </w:r>
+          </w:p>
+        </w:tc>
+        <w:tc>
+          <w:tcPr>
+            <w:tcW w:w="1102" w:type="pct"/>
+          </w:tcPr>
+          <w:p>
+            <w:pPr>
+              <w:pStyle w:val="BodyText"/>
+              <w:jc w:val="left"/>
+              <w:rPr>
+                <w:rFonts w:ascii="Times New Roman" w:hAnsi="Times New Roman"/>
+                <w:bCs/>
+                <w:sz w:val="18"/>
+                <w:szCs w:val="18"/>
+                <w:lang w:val="es-EC"/>
+              </w:rPr>
+            </w:pPr>
+            <w:r>
+              <w:rPr>
+                <w:rFonts w:ascii="Times New Roman" w:hAnsi="Times New Roman"/>
+                <w:bCs/>
+                <w:sz w:val="18"/>
+                <w:szCs w:val="18"/>
+                <w:lang w:val="es-EC"/>
+              </w:rPr>
+              <w:t>Desarrollo</w:t>
+            </w:r>
+          </w:p>
+        </w:tc>
+        <w:tc>
+          <w:tcPr>
+            <w:tcW w:w="3484" w:type="pct"/>
+          </w:tcPr>
+          <w:p>
+            <w:pPr>
+              <w:pStyle w:val="BodyText"/>
+              <w:jc w:val="left"/>
+              <w:rPr>
+                <w:rFonts w:ascii="Times New Roman" w:hAnsi="Times New Roman"/>
+                <w:bCs/>
+                <w:sz w:val="18"/>
+                <w:szCs w:val="18"/>
+                <w:lang w:val="es-EC"/>
+              </w:rPr>
+            </w:pPr>
+            <w:r>
+              <w:rPr>
+                <w:rFonts w:ascii="Times New Roman" w:hAnsi="Times New Roman"/>
+                <w:bCs/>
+                <w:sz w:val="18"/>
+                <w:szCs w:val="18"/>
+                <w:lang w:val="es-EC"/>
+              </w:rPr>
+              <w:t>Inicio de implementación de herramienta de comunicación Cliente-Asesor V-0.1</w:t>
+            </w:r>
+          </w:p>
+        </w:tc>
+      </w:tr>
+      <w:tr>
+        <w:tc>
+          <w:tcPr>
+            <w:tcW w:w="414" w:type="pct"/>
+            <w:vAlign w:val="center"/>
+          </w:tcPr>
+          <w:p>
+            <w:pPr>
+              <w:pStyle w:val="Default"/>
+              <w:jc w:val="center"/>
+              <w:rPr>
+                <w:color w:val="auto"/>
+                <w:sz w:val="18"/>
+                <w:szCs w:val="18"/>
+                <w:lang w:val="es-EC"/>
+              </w:rPr>
+            </w:pPr>
+            <w:r>
+              <w:rPr>
+                <w:color w:val="auto"/>
+                <w:sz w:val="18"/>
+                <w:szCs w:val="18"/>
+                <w:lang w:val="es-EC"/>
+              </w:rPr>
+              <w:t>25.</w:t>
+            </w:r>
+          </w:p>
+        </w:tc>
+        <w:tc>
+          <w:tcPr>
+            <w:tcW w:w="1102" w:type="pct"/>
+          </w:tcPr>
+          <w:p>
+            <w:pPr>
+              <w:pStyle w:val="BodyText"/>
+              <w:jc w:val="left"/>
+              <w:rPr>
+                <w:rFonts w:ascii="Times New Roman" w:hAnsi="Times New Roman"/>
+                <w:bCs/>
+                <w:sz w:val="18"/>
+                <w:szCs w:val="18"/>
+                <w:lang w:val="es-EC"/>
+              </w:rPr>
+            </w:pPr>
+            <w:r>
+              <w:rPr>
+                <w:rFonts w:ascii="Times New Roman" w:hAnsi="Times New Roman"/>
+                <w:bCs/>
+                <w:sz w:val="18"/>
+                <w:szCs w:val="18"/>
+                <w:lang w:val="es-EC"/>
+              </w:rPr>
+              <w:t>Desarrollo</w:t>
+            </w:r>
+          </w:p>
+        </w:tc>
+        <w:tc>
+          <w:tcPr>
+            <w:tcW w:w="3484" w:type="pct"/>
+          </w:tcPr>
+          <w:p>
+            <w:pPr>
+              <w:pStyle w:val="BodyText"/>
+              <w:jc w:val="left"/>
+              <w:rPr>
+                <w:rFonts w:ascii="Times New Roman" w:hAnsi="Times New Roman"/>
+                <w:bCs/>
+                <w:sz w:val="18"/>
+                <w:szCs w:val="18"/>
+                <w:lang w:val="es-EC"/>
+              </w:rPr>
+            </w:pPr>
+            <w:r>
+              <w:rPr>
+                <w:rFonts w:ascii="Times New Roman" w:hAnsi="Times New Roman"/>
+                <w:bCs/>
+                <w:sz w:val="18"/>
+                <w:szCs w:val="18"/>
+                <w:lang w:val="es-EC"/>
+              </w:rPr>
+              <w:t>Desarrollo de herramienta Cliente – Asesor</w:t>
+            </w:r>
+          </w:p>
+        </w:tc>
+      </w:tr>
+      <w:tr>
+        <w:tc>
+          <w:tcPr>
+            <w:tcW w:w="414" w:type="pct"/>
+            <w:vAlign w:val="center"/>
+          </w:tcPr>
+          <w:p>
+            <w:pPr>
+              <w:pStyle w:val="Default"/>
+              <w:jc w:val="center"/>
+              <w:rPr>
+                <w:color w:val="auto"/>
+                <w:sz w:val="18"/>
+                <w:szCs w:val="18"/>
+                <w:lang w:val="es-EC"/>
+              </w:rPr>
+            </w:pPr>
+            <w:r>
+              <w:rPr>
+                <w:color w:val="auto"/>
+                <w:sz w:val="18"/>
+                <w:szCs w:val="18"/>
+                <w:lang w:val="es-EC"/>
+              </w:rPr>
+              <w:t>26.</w:t>
+            </w:r>
+          </w:p>
+        </w:tc>
+        <w:tc>
+          <w:tcPr>
+            <w:tcW w:w="1102" w:type="pct"/>
+          </w:tcPr>
+          <w:p>
+            <w:pPr>
+              <w:pStyle w:val="BodyText"/>
+              <w:jc w:val="left"/>
+              <w:rPr>
+                <w:rFonts w:ascii="Times New Roman" w:hAnsi="Times New Roman"/>
+                <w:bCs/>
+                <w:sz w:val="18"/>
+                <w:szCs w:val="18"/>
+                <w:lang w:val="es-EC"/>
+              </w:rPr>
+            </w:pPr>
+            <w:r>
+              <w:rPr>
+                <w:rFonts w:ascii="Times New Roman" w:hAnsi="Times New Roman"/>
+                <w:bCs/>
+                <w:sz w:val="18"/>
+                <w:szCs w:val="18"/>
+                <w:lang w:val="es-EC"/>
+              </w:rPr>
+              <w:t>Desarrollo</w:t>
+            </w:r>
+          </w:p>
+        </w:tc>
+        <w:tc>
+          <w:tcPr>
+            <w:tcW w:w="3484" w:type="pct"/>
+          </w:tcPr>
+          <w:p>
+            <w:pPr>
+              <w:pStyle w:val="BodyText"/>
+              <w:jc w:val="left"/>
+              <w:rPr>
+                <w:rFonts w:ascii="Times New Roman" w:hAnsi="Times New Roman"/>
+                <w:bCs/>
+                <w:sz w:val="18"/>
+                <w:szCs w:val="18"/>
+                <w:lang w:val="es-EC"/>
+              </w:rPr>
+            </w:pPr>
+            <w:r>
+              <w:rPr>
+                <w:rFonts w:ascii="Times New Roman" w:hAnsi="Times New Roman"/>
+                <w:bCs/>
+                <w:sz w:val="18"/>
+                <w:szCs w:val="18"/>
+                <w:lang w:val="es-EC"/>
+              </w:rPr>
+              <w:t>Desarrollo del primer workflow Cliente – Asesor V-0.1</w:t>
+            </w:r>
+          </w:p>
+        </w:tc>
+      </w:tr>
+      <w:tr>
+        <w:tc>
+          <w:tcPr>
+            <w:tcW w:w="414" w:type="pct"/>
+            <w:vAlign w:val="center"/>
+          </w:tcPr>
+          <w:p>
+            <w:pPr>
+              <w:pStyle w:val="Default"/>
+              <w:jc w:val="center"/>
+              <w:rPr>
+                <w:color w:val="auto"/>
+                <w:sz w:val="18"/>
+                <w:szCs w:val="18"/>
+                <w:lang w:val="es-EC"/>
+              </w:rPr>
+            </w:pPr>
+            <w:r>
+              <w:rPr>
+                <w:color w:val="auto"/>
+                <w:sz w:val="18"/>
+                <w:szCs w:val="18"/>
+                <w:lang w:val="es-EC"/>
+              </w:rPr>
+              <w:t>27.</w:t>
+            </w:r>
+          </w:p>
+        </w:tc>
+        <w:tc>
+          <w:tcPr>
+            <w:tcW w:w="1102" w:type="pct"/>
+          </w:tcPr>
+          <w:p>
+            <w:pPr>
+              <w:pStyle w:val="BodyText"/>
+              <w:jc w:val="left"/>
+              <w:rPr>
+                <w:rFonts w:ascii="Times New Roman" w:hAnsi="Times New Roman"/>
+                <w:bCs/>
+                <w:sz w:val="18"/>
+                <w:szCs w:val="18"/>
+                <w:lang w:val="es-EC"/>
+              </w:rPr>
+            </w:pPr>
+            <w:r>
+              <w:rPr>
+                <w:rFonts w:ascii="Times New Roman" w:hAnsi="Times New Roman"/>
+                <w:bCs/>
+                <w:sz w:val="18"/>
+                <w:szCs w:val="18"/>
+                <w:lang w:val="es-EC"/>
+              </w:rPr>
+              <w:t>Desarrollo</w:t>
+            </w:r>
+          </w:p>
+        </w:tc>
+        <w:tc>
+          <w:tcPr>
+            <w:tcW w:w="3484" w:type="pct"/>
+          </w:tcPr>
+          <w:p>
+            <w:pPr>
+              <w:pStyle w:val="BodyText"/>
+              <w:jc w:val="left"/>
+              <w:rPr>
+                <w:rFonts w:ascii="Times New Roman" w:hAnsi="Times New Roman"/>
+                <w:bCs/>
+                <w:sz w:val="18"/>
+                <w:szCs w:val="18"/>
+                <w:lang w:val="es-EC"/>
+              </w:rPr>
+            </w:pPr>
+            <w:r>
+              <w:rPr>
+                <w:rFonts w:ascii="Times New Roman" w:hAnsi="Times New Roman"/>
+                <w:bCs/>
+                <w:sz w:val="18"/>
+                <w:szCs w:val="18"/>
+                <w:lang w:val="es-EC"/>
+              </w:rPr>
+              <w:t>Desarrollo de la herramienta Cliente – Asesor V-0.2</w:t>
+            </w:r>
+          </w:p>
+        </w:tc>
+      </w:tr>
+      <w:tr>
+        <w:tc>
+          <w:tcPr>
+            <w:tcW w:w="414" w:type="pct"/>
+            <w:vAlign w:val="center"/>
+          </w:tcPr>
+          <w:p>
+            <w:pPr>
+              <w:pStyle w:val="Default"/>
+              <w:jc w:val="center"/>
+              <w:rPr>
+                <w:color w:val="auto"/>
+                <w:sz w:val="18"/>
+                <w:szCs w:val="18"/>
+                <w:lang w:val="es-EC"/>
+              </w:rPr>
+            </w:pPr>
+            <w:r>
+              <w:rPr>
+                <w:color w:val="auto"/>
+                <w:sz w:val="18"/>
+                <w:szCs w:val="18"/>
+                <w:lang w:val="es-EC"/>
+              </w:rPr>
+              <w:t>28.</w:t>
+            </w:r>
+          </w:p>
+        </w:tc>
+        <w:tc>
+          <w:tcPr>
+            <w:tcW w:w="1102" w:type="pct"/>
+          </w:tcPr>
+          <w:p>
+            <w:pPr>
+              <w:pStyle w:val="BodyText"/>
+              <w:jc w:val="left"/>
+              <w:rPr>
+                <w:rFonts w:ascii="Times New Roman" w:hAnsi="Times New Roman"/>
+                <w:bCs/>
+                <w:sz w:val="18"/>
+                <w:szCs w:val="18"/>
+                <w:lang w:val="es-EC"/>
+              </w:rPr>
+            </w:pPr>
+            <w:r>
+              <w:rPr>
+                <w:rFonts w:ascii="Times New Roman" w:hAnsi="Times New Roman"/>
+                <w:bCs/>
+                <w:sz w:val="18"/>
+                <w:szCs w:val="18"/>
+                <w:lang w:val="es-EC"/>
+              </w:rPr>
+              <w:t>Desarrollo</w:t>
+            </w:r>
+          </w:p>
+        </w:tc>
+        <w:tc>
+          <w:tcPr>
+            <w:tcW w:w="3484" w:type="pct"/>
+          </w:tcPr>
+          <w:p>
+            <w:pPr>
+              <w:pStyle w:val="BodyText"/>
+              <w:jc w:val="left"/>
+              <w:rPr>
+                <w:rFonts w:ascii="Times New Roman" w:hAnsi="Times New Roman"/>
+                <w:bCs/>
+                <w:sz w:val="18"/>
+                <w:szCs w:val="18"/>
+                <w:lang w:val="es-EC"/>
+              </w:rPr>
+            </w:pPr>
+            <w:r>
+              <w:rPr>
+                <w:rFonts w:ascii="Times New Roman" w:hAnsi="Times New Roman"/>
+                <w:bCs/>
+                <w:sz w:val="18"/>
+                <w:szCs w:val="18"/>
+                <w:lang w:val="es-EC"/>
+              </w:rPr>
+              <w:t>Desarrollo de la herramienta Cliente – Asesor V-0.3</w:t>
+            </w:r>
+          </w:p>
+        </w:tc>
+      </w:tr>
+      <w:tr>
+        <w:tc>
+          <w:tcPr>
+            <w:tcW w:w="414" w:type="pct"/>
+            <w:vAlign w:val="center"/>
+          </w:tcPr>
+          <w:p>
+            <w:pPr>
+              <w:pStyle w:val="Default"/>
+              <w:jc w:val="center"/>
+              <w:rPr>
+                <w:color w:val="auto"/>
+                <w:sz w:val="18"/>
+                <w:szCs w:val="18"/>
+                <w:lang w:val="es-EC"/>
+              </w:rPr>
+            </w:pPr>
+            <w:r>
+              <w:rPr>
+                <w:color w:val="auto"/>
+                <w:sz w:val="18"/>
+                <w:szCs w:val="18"/>
+                <w:lang w:val="es-EC"/>
+              </w:rPr>
+              <w:t>29.</w:t>
+            </w:r>
+          </w:p>
+        </w:tc>
+        <w:tc>
+          <w:tcPr>
+            <w:tcW w:w="1102" w:type="pct"/>
+          </w:tcPr>
+          <w:p>
+            <w:pPr>
+              <w:pStyle w:val="BodyText"/>
+              <w:jc w:val="left"/>
+              <w:rPr>
+                <w:rFonts w:ascii="Times New Roman" w:hAnsi="Times New Roman"/>
+                <w:bCs/>
+                <w:sz w:val="18"/>
+                <w:szCs w:val="18"/>
+                <w:lang w:val="es-EC"/>
+              </w:rPr>
+            </w:pPr>
+            <w:r>
+              <w:rPr>
+                <w:rFonts w:ascii="Times New Roman" w:hAnsi="Times New Roman"/>
+                <w:bCs/>
+                <w:sz w:val="18"/>
+                <w:szCs w:val="18"/>
+                <w:lang w:val="es-EC"/>
+              </w:rPr>
+              <w:t>Desarrollo</w:t>
+            </w:r>
+          </w:p>
+        </w:tc>
+        <w:tc>
+          <w:tcPr>
+            <w:tcW w:w="3484" w:type="pct"/>
+          </w:tcPr>
+          <w:p>
+            <w:pPr>
+              <w:pStyle w:val="BodyText"/>
+              <w:jc w:val="left"/>
+              <w:rPr>
+                <w:rFonts w:ascii="Times New Roman" w:hAnsi="Times New Roman"/>
+                <w:bCs/>
+                <w:sz w:val="18"/>
+                <w:szCs w:val="18"/>
+                <w:lang w:val="es-EC"/>
+              </w:rPr>
+            </w:pPr>
+            <w:r>
+              <w:rPr>
+                <w:rFonts w:ascii="Times New Roman" w:hAnsi="Times New Roman"/>
+                <w:bCs/>
+                <w:sz w:val="18"/>
+                <w:szCs w:val="18"/>
+                <w:lang w:val="es-EC"/>
+              </w:rPr>
+              <w:t>Desarrollo de la herramienta Cliente – Asesor V-0.4</w:t>
+            </w:r>
+          </w:p>
+        </w:tc>
+      </w:tr>
+      <w:tr>
+        <w:tc>
+          <w:tcPr>
+            <w:tcW w:w="414" w:type="pct"/>
+            <w:vAlign w:val="center"/>
+          </w:tcPr>
+          <w:p>
+            <w:pPr>
+              <w:pStyle w:val="Default"/>
+              <w:jc w:val="center"/>
+              <w:rPr>
+                <w:color w:val="auto"/>
+                <w:sz w:val="18"/>
+                <w:szCs w:val="18"/>
+                <w:lang w:val="es-EC"/>
+              </w:rPr>
+            </w:pPr>
+            <w:r>
+              <w:rPr>
+                <w:color w:val="auto"/>
+                <w:sz w:val="18"/>
+                <w:szCs w:val="18"/>
+                <w:lang w:val="es-EC"/>
+              </w:rPr>
+              <w:t>30.</w:t>
+            </w:r>
+          </w:p>
+        </w:tc>
+        <w:tc>
+          <w:tcPr>
+            <w:tcW w:w="1102" w:type="pct"/>
+          </w:tcPr>
+          <w:p>
+            <w:pPr>
+              <w:pStyle w:val="BodyText"/>
+              <w:jc w:val="left"/>
+              <w:rPr>
+                <w:rFonts w:ascii="Times New Roman" w:hAnsi="Times New Roman"/>
+                <w:bCs/>
+                <w:sz w:val="18"/>
+                <w:szCs w:val="18"/>
+                <w:lang w:val="es-EC"/>
+              </w:rPr>
+            </w:pPr>
+            <w:r>
+              <w:rPr>
+                <w:rFonts w:ascii="Times New Roman" w:hAnsi="Times New Roman"/>
+                <w:bCs/>
+                <w:sz w:val="18"/>
+                <w:szCs w:val="18"/>
+                <w:lang w:val="es-EC"/>
+              </w:rPr>
+              <w:t>Desarrollo</w:t>
+            </w:r>
+          </w:p>
+        </w:tc>
+        <w:tc>
+          <w:tcPr>
+            <w:tcW w:w="3484" w:type="pct"/>
+          </w:tcPr>
+          <w:p>
+            <w:pPr>
+              <w:pStyle w:val="BodyText"/>
+              <w:jc w:val="left"/>
+              <w:rPr>
+                <w:rFonts w:ascii="Times New Roman" w:hAnsi="Times New Roman"/>
+                <w:bCs/>
+                <w:sz w:val="18"/>
+                <w:szCs w:val="18"/>
+                <w:lang w:val="es-EC"/>
+              </w:rPr>
+            </w:pPr>
+            <w:r>
+              <w:rPr>
+                <w:rFonts w:ascii="Times New Roman" w:hAnsi="Times New Roman"/>
+                <w:bCs/>
+                <w:sz w:val="18"/>
+                <w:szCs w:val="18"/>
+                <w:lang w:val="es-EC"/>
+              </w:rPr>
+              <w:t>Desarrollo de la herramienta Cliente – Asesor V-0.5</w:t>
+            </w:r>
+          </w:p>
+        </w:tc>
+      </w:tr>
+      <w:tr>
+        <w:tc>
+          <w:tcPr>
+            <w:tcW w:w="414" w:type="pct"/>
+            <w:vAlign w:val="center"/>
+          </w:tcPr>
+          <w:p>
+            <w:pPr>
+              <w:pStyle w:val="Default"/>
+              <w:jc w:val="center"/>
+              <w:rPr>
+                <w:color w:val="auto"/>
+                <w:sz w:val="18"/>
+                <w:szCs w:val="18"/>
+                <w:lang w:val="es-EC"/>
+              </w:rPr>
+            </w:pPr>
+            <w:r>
+              <w:rPr>
+                <w:color w:val="auto"/>
+                <w:sz w:val="18"/>
+                <w:szCs w:val="18"/>
+                <w:lang w:val="es-EC"/>
+              </w:rPr>
+              <w:t>31.</w:t>
+            </w:r>
+          </w:p>
+        </w:tc>
+        <w:tc>
+          <w:tcPr>
+            <w:tcW w:w="1102" w:type="pct"/>
+          </w:tcPr>
+          <w:p>
+            <w:pPr>
+              <w:pStyle w:val="BodyText"/>
+              <w:jc w:val="left"/>
+              <w:rPr>
+                <w:rFonts w:ascii="Times New Roman" w:hAnsi="Times New Roman"/>
+                <w:bCs/>
+                <w:sz w:val="18"/>
+                <w:szCs w:val="18"/>
+                <w:lang w:val="es-EC"/>
+              </w:rPr>
+            </w:pPr>
+            <w:r>
+              <w:rPr>
+                <w:rFonts w:ascii="Times New Roman" w:hAnsi="Times New Roman"/>
+                <w:bCs/>
+                <w:sz w:val="18"/>
+                <w:szCs w:val="18"/>
+                <w:lang w:val="es-EC"/>
+              </w:rPr>
+              <w:t>Desarrollo</w:t>
+            </w:r>
+          </w:p>
+        </w:tc>
+        <w:tc>
+          <w:tcPr>
+            <w:tcW w:w="3484" w:type="pct"/>
+          </w:tcPr>
+          <w:p>
+            <w:pPr>
+              <w:pStyle w:val="BodyText"/>
+              <w:jc w:val="left"/>
+              <w:rPr>
+                <w:rFonts w:ascii="Times New Roman" w:hAnsi="Times New Roman"/>
+                <w:bCs/>
+                <w:sz w:val="18"/>
+                <w:szCs w:val="18"/>
+                <w:lang w:val="es-EC"/>
+              </w:rPr>
+            </w:pPr>
+            <w:r>
+              <w:rPr>
+                <w:rFonts w:ascii="Times New Roman" w:hAnsi="Times New Roman"/>
+                <w:bCs/>
+                <w:sz w:val="18"/>
+                <w:szCs w:val="18"/>
+                <w:lang w:val="es-EC"/>
+              </w:rPr>
+              <w:t>Desarrollo de la herramienta Cliente – Asesor V-0.6</w:t>
+            </w:r>
+          </w:p>
+        </w:tc>
+      </w:tr>
+      <w:tr>
+        <w:tc>
+          <w:tcPr>
+            <w:tcW w:w="414" w:type="pct"/>
+            <w:vAlign w:val="center"/>
+          </w:tcPr>
+          <w:p>
+            <w:pPr>
+              <w:pStyle w:val="Default"/>
+              <w:jc w:val="center"/>
+              <w:rPr>
+                <w:color w:val="auto"/>
+                <w:sz w:val="18"/>
+                <w:szCs w:val="18"/>
+                <w:lang w:val="es-EC"/>
+              </w:rPr>
+            </w:pPr>
+            <w:r>
+              <w:rPr>
+                <w:color w:val="auto"/>
+                <w:sz w:val="18"/>
+                <w:szCs w:val="18"/>
+                <w:lang w:val="es-EC"/>
+              </w:rPr>
+              <w:t>32.</w:t>
+            </w:r>
+          </w:p>
+        </w:tc>
+        <w:tc>
+          <w:tcPr>
+            <w:tcW w:w="1102" w:type="pct"/>
+          </w:tcPr>
+          <w:p>
+            <w:pPr>
+              <w:pStyle w:val="BodyText"/>
+              <w:jc w:val="left"/>
+              <w:rPr>
+                <w:rFonts w:ascii="Times New Roman" w:hAnsi="Times New Roman"/>
+                <w:bCs/>
+                <w:sz w:val="18"/>
+                <w:szCs w:val="18"/>
+                <w:lang w:val="es-EC"/>
+              </w:rPr>
+            </w:pPr>
+            <w:r>
+              <w:rPr>
+                <w:rFonts w:ascii="Times New Roman" w:hAnsi="Times New Roman"/>
+                <w:bCs/>
+                <w:sz w:val="18"/>
+                <w:szCs w:val="18"/>
+                <w:lang w:val="es-EC"/>
+              </w:rPr>
+              <w:t>Desarrollo</w:t>
+            </w:r>
+          </w:p>
+        </w:tc>
+        <w:tc>
+          <w:tcPr>
+            <w:tcW w:w="3484" w:type="pct"/>
+          </w:tcPr>
+          <w:p>
+            <w:pPr>
+              <w:pStyle w:val="BodyText"/>
+              <w:jc w:val="left"/>
+              <w:rPr>
+                <w:rFonts w:ascii="Times New Roman" w:hAnsi="Times New Roman"/>
+                <w:bCs/>
+                <w:sz w:val="18"/>
+                <w:szCs w:val="18"/>
+                <w:lang w:val="es-EC"/>
+              </w:rPr>
+            </w:pPr>
+            <w:r>
+              <w:rPr>
+                <w:rFonts w:ascii="Times New Roman" w:hAnsi="Times New Roman"/>
+                <w:bCs/>
+                <w:sz w:val="18"/>
+                <w:szCs w:val="18"/>
+                <w:lang w:val="es-EC"/>
+              </w:rPr>
+              <w:t>Desarrollo de la herramienta Cliente – Asesor V-0.7</w:t>
+            </w:r>
+          </w:p>
+        </w:tc>
+      </w:tr>
+      <w:tr>
+        <w:tc>
+          <w:tcPr>
+            <w:tcW w:w="414" w:type="pct"/>
+            <w:vAlign w:val="center"/>
+          </w:tcPr>
+          <w:p>
+            <w:pPr>
+              <w:pStyle w:val="Default"/>
+              <w:jc w:val="center"/>
+              <w:rPr>
+                <w:color w:val="auto"/>
+                <w:sz w:val="18"/>
+                <w:szCs w:val="18"/>
+                <w:lang w:val="es-EC"/>
+              </w:rPr>
+            </w:pPr>
+            <w:r>
+              <w:rPr>
+                <w:color w:val="auto"/>
+                <w:sz w:val="18"/>
+                <w:szCs w:val="18"/>
+                <w:lang w:val="es-EC"/>
+              </w:rPr>
+              <w:t>33.</w:t>
+            </w:r>
+          </w:p>
+        </w:tc>
+        <w:tc>
+          <w:tcPr>
+            <w:tcW w:w="1102" w:type="pct"/>
+          </w:tcPr>
+          <w:p>
+            <w:pPr>
+              <w:pStyle w:val="BodyText"/>
+              <w:jc w:val="left"/>
+              <w:rPr>
+                <w:rFonts w:ascii="Times New Roman" w:hAnsi="Times New Roman"/>
+                <w:bCs/>
+                <w:sz w:val="18"/>
+                <w:szCs w:val="18"/>
+                <w:lang w:val="es-EC"/>
+              </w:rPr>
+            </w:pPr>
+            <w:r>
+              <w:rPr>
+                <w:rFonts w:ascii="Times New Roman" w:hAnsi="Times New Roman"/>
+                <w:bCs/>
+                <w:sz w:val="18"/>
+                <w:szCs w:val="18"/>
+                <w:lang w:val="es-EC"/>
+              </w:rPr>
+              <w:t>Desarrollo</w:t>
+            </w:r>
+          </w:p>
+        </w:tc>
+        <w:tc>
+          <w:tcPr>
+            <w:tcW w:w="3484" w:type="pct"/>
+          </w:tcPr>
+          <w:p>
+            <w:pPr>
+              <w:pStyle w:val="BodyText"/>
+              <w:jc w:val="left"/>
+              <w:rPr>
+                <w:rFonts w:ascii="Times New Roman" w:hAnsi="Times New Roman"/>
+                <w:bCs/>
+                <w:sz w:val="18"/>
+                <w:szCs w:val="18"/>
+                <w:lang w:val="es-EC"/>
+              </w:rPr>
+            </w:pPr>
+            <w:r>
+              <w:rPr>
+                <w:rFonts w:ascii="Times New Roman" w:hAnsi="Times New Roman"/>
+                <w:bCs/>
+                <w:sz w:val="18"/>
+                <w:szCs w:val="18"/>
+                <w:lang w:val="es-EC"/>
+              </w:rPr>
+              <w:t>Desarrollo de la herramienta Cliente – Asesor V-0.8</w:t>
+            </w:r>
+          </w:p>
+        </w:tc>
+      </w:tr>
+      <w:tr>
+        <w:tc>
+          <w:tcPr>
+            <w:tcW w:w="414" w:type="pct"/>
+            <w:vAlign w:val="center"/>
+          </w:tcPr>
+          <w:p>
+            <w:pPr>
+              <w:pStyle w:val="Default"/>
+              <w:jc w:val="center"/>
+              <w:rPr>
+                <w:color w:val="auto"/>
+                <w:sz w:val="18"/>
+                <w:szCs w:val="18"/>
+                <w:lang w:val="es-EC"/>
+              </w:rPr>
+            </w:pPr>
+            <w:r>
+              <w:rPr>
+                <w:color w:val="auto"/>
+                <w:sz w:val="18"/>
+                <w:szCs w:val="18"/>
+                <w:lang w:val="es-EC"/>
+              </w:rPr>
+              <w:t>34.</w:t>
+            </w:r>
+          </w:p>
+        </w:tc>
+        <w:tc>
+          <w:tcPr>
+            <w:tcW w:w="1102" w:type="pct"/>
+          </w:tcPr>
+          <w:p>
+            <w:pPr>
+              <w:pStyle w:val="BodyText"/>
+              <w:jc w:val="left"/>
+              <w:rPr>
+                <w:rFonts w:ascii="Times New Roman" w:hAnsi="Times New Roman"/>
+                <w:bCs/>
+                <w:sz w:val="18"/>
+                <w:szCs w:val="18"/>
+                <w:lang w:val="es-EC"/>
+              </w:rPr>
+            </w:pPr>
+            <w:r>
+              <w:rPr>
+                <w:rFonts w:ascii="Times New Roman" w:hAnsi="Times New Roman"/>
+                <w:bCs/>
+                <w:sz w:val="18"/>
+                <w:szCs w:val="18"/>
+                <w:lang w:val="es-EC"/>
+              </w:rPr>
+              <w:t>Desarrollo</w:t>
+            </w:r>
+          </w:p>
+        </w:tc>
+        <w:tc>
+          <w:tcPr>
+            <w:tcW w:w="3484" w:type="pct"/>
+          </w:tcPr>
+          <w:p>
+            <w:pPr>
+              <w:pStyle w:val="BodyText"/>
+              <w:jc w:val="left"/>
+              <w:rPr>
+                <w:rFonts w:ascii="Times New Roman" w:hAnsi="Times New Roman"/>
+                <w:bCs/>
+                <w:sz w:val="18"/>
+                <w:szCs w:val="18"/>
+                <w:lang w:val="es-EC"/>
+              </w:rPr>
+            </w:pPr>
+            <w:r>
+              <w:rPr>
+                <w:rFonts w:ascii="Times New Roman" w:hAnsi="Times New Roman"/>
+                <w:bCs/>
+                <w:sz w:val="18"/>
+                <w:szCs w:val="18"/>
+                <w:lang w:val="es-EC"/>
+              </w:rPr>
+              <w:t>Desarrollo</w:t>
+            </w:r>
+            <w:r>
+              <w:rPr>
+                <w:rFonts w:ascii="Times New Roman" w:hAnsi="Times New Roman"/>
+                <w:bCs/>
+                <w:sz w:val="18"/>
+                <w:szCs w:val="18"/>
+                <w:lang w:val="es-EC"/>
+              </w:rPr>
+              <w:t xml:space="preserve"> de la herramienta Cliente – Asesor V-0.9</w:t>
+            </w:r>
+          </w:p>
+        </w:tc>
+      </w:tr>
+      <w:tr>
+        <w:tc>
+          <w:tcPr>
+            <w:tcW w:w="414" w:type="pct"/>
+            <w:vAlign w:val="center"/>
+          </w:tcPr>
+          <w:p>
+            <w:pPr>
+              <w:pStyle w:val="Default"/>
+              <w:jc w:val="center"/>
+              <w:rPr>
+                <w:color w:val="auto"/>
+                <w:sz w:val="18"/>
+                <w:szCs w:val="18"/>
+                <w:lang w:val="es-EC"/>
+              </w:rPr>
+            </w:pPr>
+            <w:r>
+              <w:rPr>
+                <w:color w:val="auto"/>
+                <w:sz w:val="18"/>
+                <w:szCs w:val="18"/>
+                <w:lang w:val="es-EC"/>
+              </w:rPr>
+              <w:t>35.</w:t>
+            </w:r>
+          </w:p>
+        </w:tc>
+        <w:tc>
+          <w:tcPr>
+            <w:tcW w:w="1102" w:type="pct"/>
+          </w:tcPr>
+          <w:p>
+            <w:pPr>
+              <w:pStyle w:val="BodyText"/>
+              <w:jc w:val="left"/>
+              <w:rPr>
+                <w:rFonts w:ascii="Times New Roman" w:hAnsi="Times New Roman"/>
+                <w:bCs/>
+                <w:sz w:val="18"/>
+                <w:szCs w:val="18"/>
+                <w:lang w:val="es-EC"/>
+              </w:rPr>
+            </w:pPr>
+            <w:r>
+              <w:rPr>
+                <w:rFonts w:ascii="Times New Roman" w:hAnsi="Times New Roman"/>
+                <w:bCs/>
+                <w:sz w:val="18"/>
+                <w:szCs w:val="18"/>
+                <w:lang w:val="es-EC"/>
+              </w:rPr>
+              <w:t>Desarr</w:t>
+            </w:r>
+            <w:r>
+              <w:rPr>
+                <w:rFonts w:ascii="Times New Roman" w:hAnsi="Times New Roman"/>
+                <w:bCs/>
+                <w:sz w:val="18"/>
+                <w:szCs w:val="18"/>
+                <w:lang w:val="es-EC"/>
+              </w:rPr>
+              <w:t>ollo</w:t>
+            </w:r>
+          </w:p>
+        </w:tc>
+        <w:tc>
+          <w:tcPr>
+            <w:tcW w:w="3484" w:type="pct"/>
+          </w:tcPr>
+          <w:p>
+            <w:pPr>
+              <w:pStyle w:val="BodyText"/>
+              <w:jc w:val="left"/>
+              <w:rPr>
+                <w:rFonts w:ascii="Times New Roman" w:hAnsi="Times New Roman"/>
+                <w:bCs/>
+                <w:sz w:val="18"/>
+                <w:szCs w:val="18"/>
+                <w:lang w:val="es-EC"/>
+              </w:rPr>
+            </w:pPr>
+            <w:r>
+              <w:rPr>
+                <w:rFonts w:ascii="Times New Roman" w:hAnsi="Times New Roman"/>
+                <w:bCs/>
+                <w:sz w:val="18"/>
+                <w:szCs w:val="18"/>
+                <w:lang w:val="es-EC"/>
+              </w:rPr>
+              <w:t>Integración de la herramienta Cliente – Asesor con el chatbot “Martina”</w:t>
+            </w:r>
+          </w:p>
+        </w:tc>
+      </w:tr>
+      <w:tr>
+        <w:tc>
+          <w:tcPr>
+            <w:tcW w:w="414" w:type="pct"/>
+            <w:vAlign w:val="center"/>
+          </w:tcPr>
+          <w:p>
+            <w:pPr>
+              <w:pStyle w:val="Default"/>
+              <w:jc w:val="center"/>
+              <w:rPr>
+                <w:color w:val="auto"/>
+                <w:sz w:val="18"/>
+                <w:szCs w:val="18"/>
+                <w:lang w:val="es-EC"/>
+              </w:rPr>
+            </w:pPr>
+            <w:r>
+              <w:rPr>
+                <w:color w:val="auto"/>
+                <w:sz w:val="18"/>
+                <w:szCs w:val="18"/>
+                <w:lang w:val="es-EC"/>
+              </w:rPr>
+              <w:t>36.</w:t>
+            </w:r>
+          </w:p>
+        </w:tc>
+        <w:tc>
+          <w:tcPr>
+            <w:tcW w:w="1102" w:type="pct"/>
+          </w:tcPr>
+          <w:p>
+            <w:pPr>
+              <w:pStyle w:val="BodyText"/>
+              <w:jc w:val="left"/>
+              <w:rPr>
+                <w:rFonts w:ascii="Times New Roman" w:hAnsi="Times New Roman"/>
+                <w:bCs/>
+                <w:sz w:val="18"/>
+                <w:szCs w:val="18"/>
+                <w:lang w:val="es-EC"/>
+              </w:rPr>
+            </w:pPr>
+            <w:r>
+              <w:rPr>
+                <w:rFonts w:ascii="Times New Roman" w:hAnsi="Times New Roman"/>
+                <w:bCs/>
+                <w:sz w:val="18"/>
+                <w:szCs w:val="18"/>
+                <w:lang w:val="es-EC"/>
+              </w:rPr>
+              <w:t>Desarrollo</w:t>
+            </w:r>
+          </w:p>
+        </w:tc>
+        <w:tc>
+          <w:tcPr>
+            <w:tcW w:w="3484" w:type="pct"/>
+          </w:tcPr>
+          <w:p>
+            <w:pPr>
+              <w:pStyle w:val="BodyText"/>
+              <w:jc w:val="left"/>
+              <w:rPr>
+                <w:rFonts w:ascii="Times New Roman" w:hAnsi="Times New Roman"/>
+                <w:bCs/>
+                <w:sz w:val="18"/>
+                <w:szCs w:val="18"/>
+                <w:lang w:val="es-EC"/>
+              </w:rPr>
+            </w:pPr>
+            <w:r>
+              <w:rPr>
+                <w:rFonts w:ascii="Times New Roman" w:hAnsi="Times New Roman"/>
+                <w:bCs/>
+                <w:sz w:val="18"/>
+                <w:szCs w:val="18"/>
+                <w:lang w:val="es-EC"/>
+              </w:rPr>
+              <w:t>Pruebas de funcionamiento general del chatbot “Martina”</w:t>
+            </w:r>
+          </w:p>
+        </w:tc>
+      </w:tr>
+      <w:tr>
+        <w:tc>
+          <w:tcPr>
+            <w:tcW w:w="414" w:type="pct"/>
+            <w:vAlign w:val="center"/>
+          </w:tcPr>
+          <w:p>
+            <w:pPr>
+              <w:pStyle w:val="Default"/>
+              <w:jc w:val="center"/>
+              <w:rPr>
+                <w:color w:val="auto"/>
+                <w:sz w:val="18"/>
+                <w:szCs w:val="18"/>
+                <w:lang w:val="es-EC"/>
+              </w:rPr>
+            </w:pPr>
+            <w:r>
+              <w:rPr>
+                <w:color w:val="auto"/>
+                <w:sz w:val="18"/>
+                <w:szCs w:val="18"/>
+                <w:lang w:val="es-EC"/>
+              </w:rPr>
+              <w:t>37.</w:t>
+            </w:r>
+          </w:p>
+        </w:tc>
+        <w:tc>
+          <w:tcPr>
+            <w:tcW w:w="1102" w:type="pct"/>
+          </w:tcPr>
+          <w:p>
+            <w:pPr>
+              <w:pStyle w:val="BodyText"/>
+              <w:jc w:val="left"/>
+              <w:rPr>
+                <w:rFonts w:ascii="Times New Roman" w:hAnsi="Times New Roman"/>
+                <w:bCs/>
+                <w:sz w:val="18"/>
+                <w:szCs w:val="18"/>
+                <w:lang w:val="es-EC"/>
+              </w:rPr>
+            </w:pPr>
+            <w:r>
+              <w:rPr>
+                <w:rFonts w:ascii="Times New Roman" w:hAnsi="Times New Roman"/>
+                <w:bCs/>
+                <w:sz w:val="18"/>
+                <w:szCs w:val="18"/>
+                <w:lang w:val="es-EC"/>
+              </w:rPr>
+              <w:t>Desarrollo</w:t>
+            </w:r>
+          </w:p>
+        </w:tc>
+        <w:tc>
+          <w:tcPr>
+            <w:tcW w:w="3484" w:type="pct"/>
+          </w:tcPr>
+          <w:p>
+            <w:pPr>
+              <w:pStyle w:val="BodyText"/>
+              <w:jc w:val="left"/>
+              <w:rPr>
+                <w:rFonts w:ascii="Times New Roman" w:hAnsi="Times New Roman"/>
+                <w:bCs/>
+                <w:sz w:val="18"/>
+                <w:szCs w:val="18"/>
+                <w:lang w:val="es-EC"/>
+              </w:rPr>
+            </w:pPr>
+            <w:r>
+              <w:rPr>
+                <w:rFonts w:ascii="Times New Roman" w:hAnsi="Times New Roman"/>
+                <w:bCs/>
+                <w:sz w:val="18"/>
+                <w:szCs w:val="18"/>
+                <w:lang w:val="es-EC"/>
+              </w:rPr>
+              <w:t>Despliegue y producción de la plataforma de firmas electrónicas y el chatbot “Martina” en conjunto</w:t>
+            </w:r>
+          </w:p>
+        </w:tc>
+      </w:tr>
+      <w:tr>
+        <w:tc>
+          <w:tcPr>
+            <w:tcW w:w="414" w:type="pct"/>
+            <w:vAlign w:val="center"/>
+          </w:tcPr>
+          <w:p>
+            <w:pPr>
+              <w:pStyle w:val="Default"/>
+              <w:jc w:val="center"/>
+              <w:rPr>
+                <w:color w:val="auto"/>
+                <w:sz w:val="18"/>
+                <w:szCs w:val="18"/>
+                <w:lang w:val="es-EC"/>
+              </w:rPr>
+            </w:pPr>
+            <w:r>
+              <w:rPr>
+                <w:color w:val="auto"/>
+                <w:sz w:val="18"/>
+                <w:szCs w:val="18"/>
+                <w:lang w:val="es-EC"/>
+              </w:rPr>
+              <w:lastRenderedPageBreak/>
+              <w:t>38.</w:t>
+            </w:r>
+          </w:p>
+        </w:tc>
+        <w:tc>
+          <w:tcPr>
+            <w:tcW w:w="1102" w:type="pct"/>
+          </w:tcPr>
+          <w:p>
+            <w:pPr>
+              <w:pStyle w:val="BodyText"/>
+              <w:jc w:val="left"/>
+              <w:rPr>
+                <w:rFonts w:ascii="Times New Roman" w:hAnsi="Times New Roman"/>
+                <w:bCs/>
+                <w:sz w:val="18"/>
+                <w:szCs w:val="18"/>
+                <w:lang w:val="es-EC"/>
+              </w:rPr>
+            </w:pPr>
+            <w:r>
+              <w:rPr>
+                <w:rFonts w:ascii="Times New Roman" w:hAnsi="Times New Roman"/>
+                <w:bCs/>
+                <w:sz w:val="18"/>
+                <w:szCs w:val="18"/>
+                <w:lang w:val="es-EC"/>
+              </w:rPr>
+              <w:t>Desarrollo</w:t>
+            </w:r>
+          </w:p>
+        </w:tc>
+        <w:tc>
+          <w:tcPr>
+            <w:tcW w:w="3484" w:type="pct"/>
+          </w:tcPr>
+          <w:p>
+            <w:pPr>
+              <w:pStyle w:val="BodyText"/>
+              <w:jc w:val="left"/>
+              <w:rPr>
+                <w:rFonts w:ascii="Times New Roman" w:hAnsi="Times New Roman"/>
+                <w:bCs/>
+                <w:sz w:val="18"/>
+                <w:szCs w:val="18"/>
+                <w:lang w:val="es-EC"/>
+              </w:rPr>
+            </w:pPr>
+            <w:r>
+              <w:rPr>
+                <w:rFonts w:ascii="Times New Roman" w:hAnsi="Times New Roman"/>
+                <w:bCs/>
+                <w:sz w:val="18"/>
+                <w:szCs w:val="18"/>
+                <w:lang w:val="es-EC"/>
+              </w:rPr>
+              <w:t>Verificación de funcionamiento de la plataforma y el chatbot</w:t>
+            </w:r>
+          </w:p>
+        </w:tc>
+      </w:tr>
+      <w:tr>
+        <w:tc>
+          <w:tcPr>
+            <w:tcW w:w="414" w:type="pct"/>
+            <w:vAlign w:val="center"/>
+          </w:tcPr>
+          <w:p>
+            <w:pPr>
+              <w:pStyle w:val="Default"/>
+              <w:jc w:val="center"/>
+              <w:rPr>
+                <w:color w:val="auto"/>
+                <w:sz w:val="18"/>
+                <w:szCs w:val="18"/>
+                <w:lang w:val="es-EC"/>
+              </w:rPr>
+            </w:pPr>
+            <w:r>
+              <w:rPr>
+                <w:color w:val="auto"/>
+                <w:sz w:val="18"/>
+                <w:szCs w:val="18"/>
+                <w:lang w:val="es-EC"/>
+              </w:rPr>
+              <w:t>39.</w:t>
+            </w:r>
+          </w:p>
+        </w:tc>
+        <w:tc>
+          <w:tcPr>
+            <w:tcW w:w="1102" w:type="pct"/>
+          </w:tcPr>
+          <w:p>
+            <w:pPr>
+              <w:pStyle w:val="BodyText"/>
+              <w:jc w:val="left"/>
+              <w:rPr>
+                <w:rFonts w:ascii="Times New Roman" w:hAnsi="Times New Roman"/>
+                <w:bCs/>
+                <w:sz w:val="18"/>
+                <w:szCs w:val="18"/>
+                <w:lang w:val="es-EC"/>
+              </w:rPr>
+            </w:pPr>
+            <w:r>
+              <w:rPr>
+                <w:rFonts w:ascii="Times New Roman" w:hAnsi="Times New Roman"/>
+                <w:bCs/>
+                <w:sz w:val="18"/>
+                <w:szCs w:val="18"/>
+                <w:lang w:val="es-EC"/>
+              </w:rPr>
+              <w:t>Desarrollo</w:t>
+            </w:r>
+          </w:p>
+        </w:tc>
+        <w:tc>
+          <w:tcPr>
+            <w:tcW w:w="3484" w:type="pct"/>
+          </w:tcPr>
+          <w:p>
+            <w:pPr>
+              <w:pStyle w:val="BodyText"/>
+              <w:jc w:val="left"/>
+              <w:rPr>
+                <w:rFonts w:ascii="Times New Roman" w:hAnsi="Times New Roman"/>
+                <w:bCs/>
+                <w:sz w:val="18"/>
+                <w:szCs w:val="18"/>
+                <w:lang w:val="es-EC"/>
+              </w:rPr>
+            </w:pPr>
+            <w:r>
+              <w:rPr>
+                <w:rFonts w:ascii="Times New Roman" w:hAnsi="Times New Roman"/>
+                <w:bCs/>
+                <w:sz w:val="18"/>
+                <w:szCs w:val="18"/>
+                <w:lang w:val="es-EC"/>
+              </w:rPr>
+              <w:t>Actualización de la herramienta Cliente – Asesor V-0.1.1</w:t>
+            </w:r>
+          </w:p>
+        </w:tc>
+      </w:tr>
+      <w:tr>
+        <w:tc>
+          <w:tcPr>
+            <w:tcW w:w="414" w:type="pct"/>
+            <w:vAlign w:val="center"/>
+          </w:tcPr>
+          <w:p>
+            <w:pPr>
+              <w:pStyle w:val="Default"/>
+              <w:jc w:val="center"/>
+              <w:rPr>
+                <w:color w:val="auto"/>
+                <w:sz w:val="18"/>
+                <w:szCs w:val="18"/>
+                <w:lang w:val="es-EC"/>
+              </w:rPr>
+            </w:pPr>
+            <w:r>
+              <w:rPr>
+                <w:color w:val="auto"/>
+                <w:sz w:val="18"/>
+                <w:szCs w:val="18"/>
+                <w:lang w:val="es-EC"/>
+              </w:rPr>
+              <w:t>40.</w:t>
+            </w:r>
+          </w:p>
+        </w:tc>
+        <w:tc>
+          <w:tcPr>
+            <w:tcW w:w="1102" w:type="pct"/>
+          </w:tcPr>
+          <w:p>
+            <w:pPr>
+              <w:pStyle w:val="BodyText"/>
+              <w:jc w:val="left"/>
+              <w:rPr>
+                <w:rFonts w:ascii="Times New Roman" w:hAnsi="Times New Roman"/>
+                <w:bCs/>
+                <w:sz w:val="18"/>
+                <w:szCs w:val="18"/>
+                <w:lang w:val="es-EC"/>
+              </w:rPr>
+            </w:pPr>
+            <w:r>
+              <w:rPr>
+                <w:rFonts w:ascii="Times New Roman" w:hAnsi="Times New Roman"/>
+                <w:bCs/>
+                <w:sz w:val="18"/>
+                <w:szCs w:val="18"/>
+                <w:lang w:val="es-EC"/>
+              </w:rPr>
+              <w:t>Desarrollo</w:t>
+            </w:r>
+          </w:p>
+        </w:tc>
+        <w:tc>
+          <w:tcPr>
+            <w:tcW w:w="3484" w:type="pct"/>
+          </w:tcPr>
+          <w:p>
+            <w:pPr>
+              <w:pStyle w:val="BodyText"/>
+              <w:jc w:val="left"/>
+              <w:rPr>
+                <w:rFonts w:ascii="Times New Roman" w:hAnsi="Times New Roman"/>
+                <w:bCs/>
+                <w:sz w:val="18"/>
+                <w:szCs w:val="18"/>
+                <w:lang w:val="es-EC"/>
+              </w:rPr>
+            </w:pPr>
+            <w:r>
+              <w:rPr>
+                <w:rFonts w:ascii="Times New Roman" w:hAnsi="Times New Roman"/>
+                <w:bCs/>
+                <w:sz w:val="18"/>
+                <w:szCs w:val="18"/>
+                <w:lang w:val="es-EC"/>
+              </w:rPr>
+              <w:t>Actualización de la herramienta Cliente – Asesor V-0.1.2</w:t>
+            </w:r>
+          </w:p>
+        </w:tc>
+      </w:tr>
+      <w:tr>
+        <w:tc>
+          <w:tcPr>
+            <w:tcW w:w="414" w:type="pct"/>
+            <w:vAlign w:val="center"/>
+          </w:tcPr>
+          <w:p>
+            <w:pPr>
+              <w:pStyle w:val="Default"/>
+              <w:jc w:val="center"/>
+              <w:rPr>
+                <w:color w:val="auto"/>
+                <w:sz w:val="18"/>
+                <w:szCs w:val="18"/>
+                <w:lang w:val="es-EC"/>
+              </w:rPr>
+            </w:pPr>
+            <w:r>
+              <w:rPr>
+                <w:color w:val="auto"/>
+                <w:sz w:val="18"/>
+                <w:szCs w:val="18"/>
+                <w:lang w:val="es-EC"/>
+              </w:rPr>
+              <w:t>41.</w:t>
+            </w:r>
+          </w:p>
+        </w:tc>
+        <w:tc>
+          <w:tcPr>
+            <w:tcW w:w="1102" w:type="pct"/>
+          </w:tcPr>
+          <w:p>
+            <w:pPr>
+              <w:pStyle w:val="BodyText"/>
+              <w:jc w:val="left"/>
+              <w:rPr>
+                <w:rFonts w:ascii="Times New Roman" w:hAnsi="Times New Roman"/>
+                <w:bCs/>
+                <w:sz w:val="18"/>
+                <w:szCs w:val="18"/>
+                <w:lang w:val="es-EC"/>
+              </w:rPr>
+            </w:pPr>
+            <w:r>
+              <w:rPr>
+                <w:rFonts w:ascii="Times New Roman" w:hAnsi="Times New Roman"/>
+                <w:bCs/>
+                <w:sz w:val="18"/>
+                <w:szCs w:val="18"/>
+                <w:lang w:val="es-EC"/>
+              </w:rPr>
+              <w:t>Desarrollo</w:t>
+            </w:r>
+          </w:p>
+        </w:tc>
+        <w:tc>
+          <w:tcPr>
+            <w:tcW w:w="3484" w:type="pct"/>
+          </w:tcPr>
+          <w:p>
+            <w:pPr>
+              <w:pStyle w:val="BodyText"/>
+              <w:jc w:val="left"/>
+              <w:rPr>
+                <w:rFonts w:ascii="Times New Roman" w:hAnsi="Times New Roman"/>
+                <w:bCs/>
+                <w:sz w:val="18"/>
+                <w:szCs w:val="18"/>
+                <w:lang w:val="es-EC"/>
+              </w:rPr>
+            </w:pPr>
+            <w:r>
+              <w:rPr>
+                <w:rFonts w:ascii="Times New Roman" w:hAnsi="Times New Roman"/>
+                <w:bCs/>
+                <w:sz w:val="18"/>
+                <w:szCs w:val="18"/>
+                <w:lang w:val="es-EC"/>
+              </w:rPr>
+              <w:t>Introducción a SuiteCRM</w:t>
+            </w:r>
+          </w:p>
+        </w:tc>
+      </w:tr>
+      <w:tr>
+        <w:tc>
+          <w:tcPr>
+            <w:tcW w:w="414" w:type="pct"/>
+            <w:vAlign w:val="center"/>
+          </w:tcPr>
+          <w:p>
+            <w:pPr>
+              <w:pStyle w:val="Default"/>
+              <w:jc w:val="center"/>
+              <w:rPr>
+                <w:color w:val="auto"/>
+                <w:sz w:val="18"/>
+                <w:szCs w:val="18"/>
+                <w:lang w:val="es-EC"/>
+              </w:rPr>
+            </w:pPr>
+            <w:r>
+              <w:rPr>
+                <w:color w:val="auto"/>
+                <w:sz w:val="18"/>
+                <w:szCs w:val="18"/>
+                <w:lang w:val="es-EC"/>
+              </w:rPr>
+              <w:t>42.</w:t>
+            </w:r>
+          </w:p>
+        </w:tc>
+        <w:tc>
+          <w:tcPr>
+            <w:tcW w:w="1102" w:type="pct"/>
+          </w:tcPr>
+          <w:p>
+            <w:pPr>
+              <w:pStyle w:val="BodyText"/>
+              <w:jc w:val="left"/>
+              <w:rPr>
+                <w:rFonts w:ascii="Times New Roman" w:hAnsi="Times New Roman"/>
+                <w:bCs/>
+                <w:sz w:val="18"/>
+                <w:szCs w:val="18"/>
+                <w:lang w:val="es-EC"/>
+              </w:rPr>
+            </w:pPr>
+            <w:r>
+              <w:rPr>
+                <w:rFonts w:ascii="Times New Roman" w:hAnsi="Times New Roman"/>
+                <w:bCs/>
+                <w:sz w:val="18"/>
+                <w:szCs w:val="18"/>
+                <w:lang w:val="es-EC"/>
+              </w:rPr>
+              <w:t>Desarrollo</w:t>
+            </w:r>
+          </w:p>
+        </w:tc>
+        <w:tc>
+          <w:tcPr>
+            <w:tcW w:w="3484" w:type="pct"/>
+          </w:tcPr>
+          <w:p>
+            <w:pPr>
+              <w:pStyle w:val="BodyText"/>
+              <w:jc w:val="left"/>
+              <w:rPr>
+                <w:rFonts w:ascii="Times New Roman" w:hAnsi="Times New Roman"/>
+                <w:bCs/>
+                <w:sz w:val="18"/>
+                <w:szCs w:val="18"/>
+                <w:lang w:val="es-EC"/>
+              </w:rPr>
+            </w:pPr>
+            <w:r>
+              <w:rPr>
+                <w:rFonts w:ascii="Times New Roman" w:hAnsi="Times New Roman"/>
+                <w:bCs/>
+                <w:sz w:val="18"/>
+                <w:szCs w:val="18"/>
+                <w:lang w:val="es-EC"/>
+              </w:rPr>
+              <w:t>Introducción a Mautic</w:t>
+            </w:r>
+          </w:p>
+        </w:tc>
+      </w:tr>
+      <w:tr>
+        <w:tc>
+          <w:tcPr>
+            <w:tcW w:w="414" w:type="pct"/>
+            <w:vAlign w:val="center"/>
+          </w:tcPr>
+          <w:p>
+            <w:pPr>
+              <w:pStyle w:val="Default"/>
+              <w:jc w:val="center"/>
+              <w:rPr>
+                <w:color w:val="auto"/>
+                <w:sz w:val="18"/>
+                <w:szCs w:val="18"/>
+                <w:lang w:val="es-EC"/>
+              </w:rPr>
+            </w:pPr>
+            <w:r>
+              <w:rPr>
+                <w:color w:val="auto"/>
+                <w:sz w:val="18"/>
+                <w:szCs w:val="18"/>
+                <w:lang w:val="es-EC"/>
+              </w:rPr>
+              <w:t>43.</w:t>
+            </w:r>
+          </w:p>
+        </w:tc>
+        <w:tc>
+          <w:tcPr>
+            <w:tcW w:w="1102" w:type="pct"/>
+          </w:tcPr>
+          <w:p>
+            <w:pPr>
+              <w:pStyle w:val="BodyText"/>
+              <w:jc w:val="left"/>
+              <w:rPr>
+                <w:rFonts w:ascii="Times New Roman" w:hAnsi="Times New Roman"/>
+                <w:bCs/>
+                <w:sz w:val="18"/>
+                <w:szCs w:val="18"/>
+                <w:lang w:val="es-EC"/>
+              </w:rPr>
+            </w:pPr>
+            <w:r>
+              <w:rPr>
+                <w:rFonts w:ascii="Times New Roman" w:hAnsi="Times New Roman"/>
+                <w:bCs/>
+                <w:sz w:val="18"/>
+                <w:szCs w:val="18"/>
+                <w:lang w:val="es-EC"/>
+              </w:rPr>
+              <w:t>Desarrollo</w:t>
+            </w:r>
+          </w:p>
+        </w:tc>
+        <w:tc>
+          <w:tcPr>
+            <w:tcW w:w="3484" w:type="pct"/>
+          </w:tcPr>
+          <w:p>
+            <w:pPr>
+              <w:pStyle w:val="BodyText"/>
+              <w:jc w:val="left"/>
+              <w:rPr>
+                <w:rFonts w:ascii="Times New Roman" w:hAnsi="Times New Roman"/>
+                <w:bCs/>
+                <w:sz w:val="18"/>
+                <w:szCs w:val="18"/>
+                <w:lang w:val="es-EC"/>
+              </w:rPr>
+            </w:pPr>
+            <w:r>
+              <w:rPr>
+                <w:rFonts w:ascii="Times New Roman" w:hAnsi="Times New Roman"/>
+                <w:bCs/>
+                <w:sz w:val="18"/>
+                <w:szCs w:val="18"/>
+                <w:lang w:val="es-EC"/>
+              </w:rPr>
+              <w:t>Investigación de integración API entre SaciERP y SuiteCRM</w:t>
+            </w:r>
+          </w:p>
+        </w:tc>
+      </w:tr>
+      <w:tr>
+        <w:tc>
+          <w:tcPr>
+            <w:tcW w:w="414" w:type="pct"/>
+            <w:vAlign w:val="center"/>
+          </w:tcPr>
+          <w:p>
+            <w:pPr>
+              <w:pStyle w:val="Default"/>
+              <w:jc w:val="center"/>
+              <w:rPr>
+                <w:color w:val="auto"/>
+                <w:sz w:val="18"/>
+                <w:szCs w:val="18"/>
+                <w:lang w:val="es-EC"/>
+              </w:rPr>
+            </w:pPr>
+            <w:r>
+              <w:rPr>
+                <w:color w:val="auto"/>
+                <w:sz w:val="18"/>
+                <w:szCs w:val="18"/>
+                <w:lang w:val="es-EC"/>
+              </w:rPr>
+              <w:t>44.</w:t>
+            </w:r>
+          </w:p>
+        </w:tc>
+        <w:tc>
+          <w:tcPr>
+            <w:tcW w:w="1102" w:type="pct"/>
+          </w:tcPr>
+          <w:p>
+            <w:pPr>
+              <w:pStyle w:val="BodyText"/>
+              <w:jc w:val="left"/>
+              <w:rPr>
+                <w:rFonts w:ascii="Times New Roman" w:hAnsi="Times New Roman"/>
+                <w:bCs/>
+                <w:sz w:val="18"/>
+                <w:szCs w:val="18"/>
+                <w:lang w:val="es-EC"/>
+              </w:rPr>
+            </w:pPr>
+            <w:r>
+              <w:rPr>
+                <w:rFonts w:ascii="Times New Roman" w:hAnsi="Times New Roman"/>
+                <w:bCs/>
+                <w:sz w:val="18"/>
+                <w:szCs w:val="18"/>
+                <w:lang w:val="es-EC"/>
+              </w:rPr>
+              <w:t>Desarrollo</w:t>
+            </w:r>
+          </w:p>
+        </w:tc>
+        <w:tc>
+          <w:tcPr>
+            <w:tcW w:w="3484" w:type="pct"/>
+          </w:tcPr>
+          <w:p>
+            <w:pPr>
+              <w:pStyle w:val="BodyText"/>
+              <w:jc w:val="left"/>
+              <w:rPr>
+                <w:rFonts w:ascii="Times New Roman" w:hAnsi="Times New Roman"/>
+                <w:bCs/>
+                <w:sz w:val="18"/>
+                <w:szCs w:val="18"/>
+                <w:lang w:val="es-EC"/>
+              </w:rPr>
+            </w:pPr>
+            <w:r>
+              <w:rPr>
+                <w:rFonts w:ascii="Times New Roman" w:hAnsi="Times New Roman"/>
+                <w:bCs/>
+                <w:sz w:val="18"/>
+                <w:szCs w:val="18"/>
+                <w:lang w:val="es-EC"/>
+              </w:rPr>
+              <w:t>Actualización del chatbot “Martina”</w:t>
+            </w:r>
+            <w:r>
+              <w:rPr>
+                <w:rFonts w:ascii="Times New Roman" w:hAnsi="Times New Roman"/>
+                <w:bCs/>
+                <w:sz w:val="18"/>
+                <w:szCs w:val="18"/>
+                <w:lang w:val="es-EC"/>
+              </w:rPr>
+              <w:t xml:space="preserve"> V-1.0</w:t>
             </w:r>
           </w:p>
         </w:tc>
@@ -5095,17 +7952,7 @@
                 <w:lang w:val="es-EC"/>
               </w:rPr>
             </w:pPr>
-          </w:p>
-        </w:tc>
-        <w:tc>
-          <w:tcPr>
-            <w:tcW w:w="1418" w:type="dxa"/>
-            <w:vAlign w:val="center"/>
-          </w:tcPr>
-          <w:p>
-            <w:pPr>
-              <w:pStyle w:val="BodyText"/>
-              <w:jc w:val="center"/>
+            <w:r>
               <w:rPr>
                 <w:rFonts w:ascii="Times New Roman" w:hAnsi="Times New Roman"/>
                 <w:b/>
@@ -5113,8 +7960,19 @@
                 <w:szCs w:val="20"/>
                 <w:lang w:val="es-EC"/>
               </w:rPr>
-            </w:pPr>
-            <w:r>
+              <w:t>X</w:t>
+            </w:r>
+          </w:p>
+        </w:tc>
+        <w:tc>
+          <w:tcPr>
+            <w:tcW w:w="1418" w:type="dxa"/>
+            <w:vAlign w:val="center"/>
+          </w:tcPr>
+          <w:p>
+            <w:pPr>
+              <w:pStyle w:val="BodyText"/>
+              <w:jc w:val="center"/>
               <w:rPr>
                 <w:rFonts w:ascii="Times New Roman" w:hAnsi="Times New Roman"/>
                 <w:b/>
@@ -5122,8 +7980,7 @@
                 <w:szCs w:val="20"/>
                 <w:lang w:val="es-EC"/>
               </w:rPr>
-              <w:t>X</w:t>
-            </w:r>
+            </w:pPr>
           </w:p>
         </w:tc>
         <w:tc>
@@ -5894,6 +8751,385 @@
           <w:lang w:val="es-EC"/>
         </w:rPr>
       </w:pPr>
+      <w:r>
+        <w:rPr>
+          <w:rFonts w:ascii="Times New Roman" w:hAnsi="Times New Roman"/>
+          <w:b/>
+          <w:noProof/>
+          <w:sz w:val="20"/>
+          <w:szCs w:val="20"/>
+          <w:lang w:val="es-ES"/>
+        </w:rPr>
+        <mc:AlternateContent>
+          <mc:Choice Requires="wps">
+            <w:drawing>
+              <wp:anchor distT="0" distB="0" distL="114300" distR="114300" simplePos="0" relativeHeight="251681792" behindDoc="0" locked="0" layoutInCell="1" allowOverlap="1" wp14:anchorId="0458943B" wp14:editId="588D666B">
+                <wp:simplePos x="0" y="0"/>
+                <wp:positionH relativeFrom="column">
+                  <wp:posOffset>-134999</wp:posOffset>
+                </wp:positionH>
+                <wp:positionV relativeFrom="paragraph">
+                  <wp:posOffset>183738</wp:posOffset>
+                </wp:positionV>
+                <wp:extent cx="1975485" cy="1052713"/>
+                <wp:effectExtent l="0" t="0" r="24765" b="14605"/>
+                <wp:wrapNone/>
+                <wp:docPr id="2" name="Text Box 12"/>
+                <wp:cNvGraphicFramePr>
+                  <a:graphicFrameLocks xmlns:a="http://schemas.openxmlformats.org/drawingml/2006/main"/>
+                </wp:cNvGraphicFramePr>
+                <a:graphic xmlns:a="http://schemas.openxmlformats.org/drawingml/2006/main">
+                  <a:graphicData uri="http://schemas.microsoft.com/office/word/2010/wordprocessingShape">
+                    <wps:wsp>
+                      <wps:cNvSpPr txBox="1">
+                        <a:spLocks noChangeArrowheads="1"/>
+                      </wps:cNvSpPr>
+                      <wps:spPr bwMode="auto">
+                        <a:xfrm>
+                          <a:off x="0" y="0"/>
+                          <a:ext cx="1975485" cy="1052713"/>
+                        </a:xfrm>
+                        <a:prstGeom prst="rect">
+                          <a:avLst/>
+                        </a:prstGeom>
+                        <a:solidFill>
+                          <a:srgbClr val="FFFFFF"/>
+                        </a:solidFill>
+                        <a:ln w="9525">
+                          <a:solidFill>
+                            <a:schemeClr val="bg1">
+                              <a:lumMod val="100000"/>
+                              <a:lumOff val="0"/>
+                            </a:schemeClr>
+                          </a:solidFill>
+                          <a:miter lim="800000"/>
+                          <a:headEnd/>
+                          <a:tailEnd/>
+                        </a:ln>
+                      </wps:spPr>
+                      <wps:txbx>
+                        <w:txbxContent>
+                          <w:p>
+                            <w:pPr>
+                              <w:spacing w:after="0" w:line="240" w:lineRule="auto"/>
+                              <w:jc w:val="center"/>
+                              <w:rPr>
+                                <w:rFonts w:ascii="Arial" w:hAnsi="Arial" w:cs="Arial"/>
+                                <w:sz w:val="20"/>
+                                <w:szCs w:val="20"/>
+                              </w:rPr>
+                            </w:pPr>
+                          </w:p>
+                          <w:p>
+                            <w:pPr>
+                              <w:spacing w:after="0" w:line="240" w:lineRule="auto"/>
+                              <w:jc w:val="center"/>
+                              <w:rPr>
+                                <w:rFonts w:ascii="Arial" w:hAnsi="Arial" w:cs="Arial"/>
+                                <w:sz w:val="20"/>
+                                <w:szCs w:val="20"/>
+                              </w:rPr>
+                            </w:pPr>
+                          </w:p>
+                          <w:p>
+                            <w:pPr>
+                              <w:spacing w:after="0"/>
+                              <w:rPr>
+                                <w:rFonts w:ascii="Arial" w:hAnsi="Arial" w:cs="Arial"/>
+                                <w:b/>
+                                <w:sz w:val="16"/>
+                                <w:szCs w:val="16"/>
+                              </w:rPr>
+                            </w:pPr>
+                            <w:r>
+                              <w:rPr>
+                                <w:rFonts w:ascii="Arial" w:hAnsi="Arial" w:cs="Arial"/>
+                                <w:b/>
+                                <w:sz w:val="16"/>
+                                <w:szCs w:val="16"/>
+                              </w:rPr>
+                              <w:t xml:space="preserve">Tutor </w:t>
+                            </w:r>
+                            <w:r>
+                              <w:rPr>
+                                <w:rFonts w:ascii="Arial" w:hAnsi="Arial" w:cs="Arial"/>
+                                <w:b/>
+                                <w:sz w:val="16"/>
+                                <w:szCs w:val="16"/>
+                              </w:rPr>
+                              <w:t xml:space="preserve">(a) </w:t>
+                            </w:r>
+                            <w:r>
+                              <w:rPr>
+                                <w:rFonts w:ascii="Arial" w:hAnsi="Arial" w:cs="Arial"/>
+                                <w:b/>
+                                <w:sz w:val="16"/>
+                                <w:szCs w:val="16"/>
+                              </w:rPr>
+                              <w:t>Empresarial / Institucional</w:t>
+                            </w:r>
+                            <w:r>
+                              <w:rPr>
+                                <w:rFonts w:ascii="Arial" w:hAnsi="Arial" w:cs="Arial"/>
+                                <w:b/>
+                                <w:sz w:val="16"/>
+                                <w:szCs w:val="16"/>
+                              </w:rPr>
+                              <w:t>/ Representante de la Comunidad</w:t>
+                            </w:r>
+                          </w:p>
+                          <w:p>
+                            <w:pPr>
+                              <w:spacing w:after="0" w:line="240" w:lineRule="auto"/>
+                              <w:rPr>
+                                <w:rFonts w:ascii="Arial" w:hAnsi="Arial" w:cs="Arial"/>
+                                <w:b/>
+                                <w:sz w:val="16"/>
+                                <w:szCs w:val="16"/>
+                              </w:rPr>
+                            </w:pPr>
+                            <w:r>
+                              <w:rPr>
+                                <w:rFonts w:ascii="Arial" w:hAnsi="Arial" w:cs="Arial"/>
+                                <w:b/>
+                                <w:sz w:val="16"/>
+                                <w:szCs w:val="16"/>
+                              </w:rPr>
+                              <w:t>Nombres y apellidos:</w:t>
+                            </w:r>
+                            <w:r>
+                              <w:rPr>
+                                <w:rFonts w:ascii="Arial" w:hAnsi="Arial" w:cs="Arial"/>
+                                <w:b/>
+                                <w:sz w:val="16"/>
+                                <w:szCs w:val="16"/>
+                              </w:rPr>
+                              <w:t xml:space="preserve"> </w:t>
+                            </w:r>
+                            <w:r>
+                              <w:rPr>
+                                <w:rFonts w:ascii="Arial" w:hAnsi="Arial" w:cs="Arial"/>
+                                <w:b/>
+                                <w:sz w:val="16"/>
+                                <w:szCs w:val="16"/>
+                              </w:rPr>
+                              <w:t>Kevin Donato Calvopiña Carpio</w:t>
+                            </w:r>
+                          </w:p>
+                          <w:p>
+                            <w:pPr>
+                              <w:rPr>
+                                <w:rFonts w:ascii="Arial" w:hAnsi="Arial" w:cs="Arial"/>
+                                <w:b/>
+                                <w:sz w:val="16"/>
+                                <w:szCs w:val="16"/>
+                              </w:rPr>
+                            </w:pPr>
+                            <w:r>
+                              <w:rPr>
+                                <w:rFonts w:ascii="Arial" w:hAnsi="Arial" w:cs="Arial"/>
+                                <w:b/>
+                                <w:sz w:val="16"/>
+                                <w:szCs w:val="16"/>
+                              </w:rPr>
+                              <w:t>CC:</w:t>
+                            </w:r>
+                            <w:r>
+                              <w:rPr>
+                                <w:rFonts w:ascii="Arial" w:hAnsi="Arial" w:cs="Arial"/>
+                                <w:b/>
+                                <w:sz w:val="16"/>
+                                <w:szCs w:val="16"/>
+                              </w:rPr>
+                              <w:t xml:space="preserve"> 1721288221</w:t>
+                            </w:r>
+                          </w:p>
+                          <w:p>
+                            <w:pPr>
+                              <w:spacing w:after="0" w:line="240" w:lineRule="auto"/>
+                              <w:rPr>
+                                <w:rFonts w:ascii="Arial" w:hAnsi="Arial" w:cs="Arial"/>
+                                <w:b/>
+                                <w:sz w:val="16"/>
+                                <w:szCs w:val="16"/>
+                              </w:rPr>
+                            </w:pPr>
+                          </w:p>
+                        </w:txbxContent>
+                      </wps:txbx>
+                      <wps:bodyPr rot="0" vert="horz" wrap="square" lIns="91440" tIns="45720" rIns="91440" bIns="45720" anchor="t" anchorCtr="0" upright="1">
+                        <a:noAutofit/>
+                      </wps:bodyPr>
+                    </wps:wsp>
+                  </a:graphicData>
+                </a:graphic>
+                <wp14:sizeRelH relativeFrom="margin">
+                  <wp14:pctWidth>0</wp14:pctWidth>
+                </wp14:sizeRelH>
+                <wp14:sizeRelV relativeFrom="margin">
+                  <wp14:pctHeight>0</wp14:pctHeight>
+                </wp14:sizeRelV>
+              </wp:anchor>
+            </w:drawing>
+          </mc:Choice>
+          <mc:Fallback>
+            <w:pict>
+              <v:shape w14:anchorId="0458943B" id="Text Box 12" o:spid="_x0000_s1035" type="#_x0000_t202" style="position:absolute;margin-left:-10.65pt;margin-top:14.45pt;width:155.55pt;height:82.9pt;z-index:251681792;visibility:visible;mso-wrap-style:square;mso-width-percent:0;mso-height-percent:0;mso-wrap-distance-left:9pt;mso-wrap-distance-top:0;mso-wrap-distance-right:9pt;mso-wrap-distance-bottom:0;mso-position-horizontal:absolute;mso-position-horizontal-relative:text;mso-position-vertical:absolute;mso-position-vertical-relative:text;mso-width-percent:0;mso-height-percent:0;mso-width-relative:margin;mso-height-relative:margin;v-text-anchor:top" o:gfxdata="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" strokecolor="white [3212]">
+                <v:textbox>
+                  <w:txbxContent>
+                    <w:p>
+                      <w:pPr>
+                        <w:spacing w:after="0" w:line="240" w:lineRule="auto"/>
+                        <w:jc w:val="center"/>
+                        <w:rPr>
+                          <w:rFonts w:ascii="Arial" w:hAnsi="Arial" w:cs="Arial"/>
+                          <w:sz w:val="20"/>
+                          <w:szCs w:val="20"/>
+                        </w:rPr>
+                      </w:pPr>
+                    </w:p>
+                    <w:p>
+                      <w:pPr>
+                        <w:spacing w:after="0" w:line="240" w:lineRule="auto"/>
+                        <w:jc w:val="center"/>
+                        <w:rPr>
+                          <w:rFonts w:ascii="Arial" w:hAnsi="Arial" w:cs="Arial"/>
+                          <w:sz w:val="20"/>
+                          <w:szCs w:val="20"/>
+                        </w:rPr>
+                      </w:pPr>
+                    </w:p>
+                    <w:p>
+                      <w:pPr>
+                        <w:spacing w:after="0"/>
+                        <w:rPr>
+                          <w:rFonts w:ascii="Arial" w:hAnsi="Arial" w:cs="Arial"/>
+                          <w:b/>
+                          <w:sz w:val="16"/>
+                          <w:szCs w:val="16"/>
+                        </w:rPr>
+                      </w:pPr>
+                      <w:r>
+                        <w:rPr>
+                          <w:rFonts w:ascii="Arial" w:hAnsi="Arial" w:cs="Arial"/>
+                          <w:b/>
+                          <w:sz w:val="16"/>
+                          <w:szCs w:val="16"/>
+                        </w:rPr>
+                        <w:t xml:space="preserve">Tutor </w:t>
+                      </w:r>
+                      <w:r>
+                        <w:rPr>
+                          <w:rFonts w:ascii="Arial" w:hAnsi="Arial" w:cs="Arial"/>
+                          <w:b/>
+                          <w:sz w:val="16"/>
+                          <w:szCs w:val="16"/>
+                        </w:rPr>
+                        <w:t xml:space="preserve">(a) </w:t>
+                      </w:r>
+                      <w:r>
+                        <w:rPr>
+                          <w:rFonts w:ascii="Arial" w:hAnsi="Arial" w:cs="Arial"/>
+                          <w:b/>
+                          <w:sz w:val="16"/>
+                          <w:szCs w:val="16"/>
+                        </w:rPr>
+                        <w:t>Empresarial / Institucional</w:t>
+                      </w:r>
+                      <w:r>
+                        <w:rPr>
+                          <w:rFonts w:ascii="Arial" w:hAnsi="Arial" w:cs="Arial"/>
+                          <w:b/>
+                          <w:sz w:val="16"/>
+                          <w:szCs w:val="16"/>
+                        </w:rPr>
+                        <w:t>/ Representante de la Comunidad</w:t>
+                      </w:r>
+                    </w:p>
+                    <w:p>
+                      <w:pPr>
+                        <w:spacing w:after="0" w:line="240" w:lineRule="auto"/>
+                        <w:rPr>
+                          <w:rFonts w:ascii="Arial" w:hAnsi="Arial" w:cs="Arial"/>
+                          <w:b/>
+                          <w:sz w:val="16"/>
+                          <w:szCs w:val="16"/>
+                        </w:rPr>
+                      </w:pPr>
+                      <w:r>
+                        <w:rPr>
+                          <w:rFonts w:ascii="Arial" w:hAnsi="Arial" w:cs="Arial"/>
+                          <w:b/>
+                          <w:sz w:val="16"/>
+                          <w:szCs w:val="16"/>
+                        </w:rPr>
+                        <w:t>Nombres y apellidos:</w:t>
+                      </w:r>
+                      <w:r>
+                        <w:rPr>
+                          <w:rFonts w:ascii="Arial" w:hAnsi="Arial" w:cs="Arial"/>
+                          <w:b/>
+                          <w:sz w:val="16"/>
+                          <w:szCs w:val="16"/>
+                        </w:rPr>
+                        <w:t xml:space="preserve"> </w:t>
+                      </w:r>
+                      <w:r>
+                        <w:rPr>
+                          <w:rFonts w:ascii="Arial" w:hAnsi="Arial" w:cs="Arial"/>
+                          <w:b/>
+                          <w:sz w:val="16"/>
+                          <w:szCs w:val="16"/>
+                        </w:rPr>
+                        <w:t>Kevin Donato Calvopiña Carpio</w:t>
+                      </w:r>
+                    </w:p>
+                    <w:p>
+                      <w:pPr>
+                        <w:rPr>
+                          <w:rFonts w:ascii="Arial" w:hAnsi="Arial" w:cs="Arial"/>
+                          <w:b/>
+                          <w:sz w:val="16"/>
+                          <w:szCs w:val="16"/>
+                        </w:rPr>
+                      </w:pPr>
+                      <w:r>
+                        <w:rPr>
+                          <w:rFonts w:ascii="Arial" w:hAnsi="Arial" w:cs="Arial"/>
+                          <w:b/>
+                          <w:sz w:val="16"/>
+                          <w:szCs w:val="16"/>
+                        </w:rPr>
+                        <w:t>CC:</w:t>
+                      </w:r>
+                      <w:r>
+                        <w:rPr>
+                          <w:rFonts w:ascii="Arial" w:hAnsi="Arial" w:cs="Arial"/>
+                          <w:b/>
+                          <w:sz w:val="16"/>
+                          <w:szCs w:val="16"/>
+                        </w:rPr>
+                        <w:t xml:space="preserve"> 1721288221</w:t>
+                      </w:r>
+                    </w:p>
+                    <w:p>
+                      <w:pPr>
+                        <w:spacing w:after="0" w:line="240" w:lineRule="auto"/>
+                        <w:rPr>
+                          <w:rFonts w:ascii="Arial" w:hAnsi="Arial" w:cs="Arial"/>
+                          <w:b/>
+                          <w:sz w:val="16"/>
+                          <w:szCs w:val="16"/>
+                        </w:rPr>
+                      </w:pPr>
+                    </w:p>
+                  </w:txbxContent>
+                </v:textbox>
+              </v:shape>
+            </w:pict>
+          </mc:Fallback>
+        </mc:AlternateContent>
+      </w:r>
     </w:p>
     <w:p>
       <w:pPr>
@@ -5918,7 +9154,7 @@
         <mc:AlternateContent>
           <mc:Choice Requires="wps">
             <w:drawing>
-              <wp:anchor distT="0" distB="0" distL="114300" distR="114300" simplePos="0" relativeHeight="251688960" behindDoc="0" locked="0" layoutInCell="1" allowOverlap="1" wp14:anchorId="7A0DF40D" wp14:editId="39AE5489">
+              <wp:anchor distT="0" distB="0" distL="114300" distR="114300" simplePos="0" relativeHeight="251688960" behindDoc="0" locked="0" layoutInCell="1" allowOverlap="1" wp14:anchorId="7A0DF40D" wp14:editId="11EC3CB3">
                 <wp:simplePos x="0" y="0"/>
                 <wp:positionH relativeFrom="column">
                   <wp:posOffset>3754755</wp:posOffset>
@@ -6035,6 +9271,15 @@
                               </w:rPr>
                               <w:t xml:space="preserve"> </w:t>
                             </w:r>
+                            <w:r>
+                              <w:rPr>
+                                <w:rFonts w:ascii="Arial" w:hAnsi="Arial" w:cs="Arial"/>
+                                <w:b/>
+                                <w:sz w:val="16"/>
+                                <w:szCs w:val="16"/>
+                              </w:rPr>
+                              <w:t>Eduardo David García Romero</w:t>
+                            </w:r>
                           </w:p>
                           <w:p>
                             <w:pPr>
@@ -6054,6 +9299,15 @@
                                 <w:szCs w:val="16"/>
                               </w:rPr>
                               <w:t>CC:</w:t>
+                            </w:r>
+                            <w:r>
+                              <w:rPr>
+                                <w:rFonts w:ascii="Arial" w:hAnsi="Arial" w:cs="Arial"/>
+                                <w:b/>
+                                <w:sz w:val="16"/>
+                                <w:szCs w:val="16"/>
+                              </w:rPr>
+                              <w:t xml:space="preserve"> 1754708798</w:t>
                             </w:r>
                           </w:p>
                           <w:p>
@@ -6087,7 +9341,7 @@
           </mc:Choice>
           <mc:Fallback>
             <w:pict>
-              <v:shape w14:anchorId="7A0DF40D" id="Text Box 10" o:spid="_x0000_s1035" type="#_x0000_t202" style="position:absolute;margin-left:295.65pt;margin-top:4.2pt;width:171.5pt;height:90pt;z-index:251688960;visibility:visible;mso-wrap-style:square;mso-width-percent:0;mso-height-percent:0;mso-wrap-distance-left:9pt;mso-wrap-distance-top:0;mso-wrap-distance-right:9pt;mso-wrap-distance-bottom:0;mso-position-horizontal:absolute;mso-position-horizontal-relative:text;mso-position-vertical:absolute;mso-position-vertical-relative:text;mso-width-percent:0;mso-height-percent:0;mso-width-relative:margin;mso-height-relative:margin;v-text-anchor:top" o:gfxdata="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" strokecolor="white [3212]">
+              <v:shape w14:anchorId="7A0DF40D" id="Text Box 10" o:spid="_x0000_s1036" type="#_x0000_t202" style="position:absolute;margin-left:295.65pt;margin-top:4.2pt;width:171.5pt;height:90pt;z-index:251688960;visibility:visible;mso-wrap-style:square;mso-width-percent:0;mso-height-percent:0;mso-wrap-distance-left:9pt;mso-wrap-distance-top:0;mso-wrap-distance-right:9pt;mso-wrap-distance-bottom:0;mso-position-horizontal:absolute;mso-position-horizontal-relative:text;mso-position-vertical:absolute;mso-position-vertical-relative:text;mso-width-percent:0;mso-height-percent:0;mso-width-relative:margin;mso-height-relative:margin;v-text-anchor:top" o:gfxdata="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" strokecolor="white [3212]">
                 <v:textbox>
                   <w:txbxContent>
                     <w:p>
@@ -6161,6 +9415,15 @@
                         </w:rPr>
                         <w:t xml:space="preserve"> </w:t>
                       </w:r>
+                      <w:r>
+                        <w:rPr>
+                          <w:rFonts w:ascii="Arial" w:hAnsi="Arial" w:cs="Arial"/>
+                          <w:b/>
+                          <w:sz w:val="16"/>
+                          <w:szCs w:val="16"/>
+                        </w:rPr>
+                        <w:t>Eduardo David García Romero</w:t>
+                      </w:r>
                     </w:p>
                     <w:p>
                       <w:pPr>
@@ -6181,6 +9444,15 @@
                         </w:rPr>
                         <w:t>CC:</w:t>
                       </w:r>
+                      <w:r>
+                        <w:rPr>
+                          <w:rFonts w:ascii="Arial" w:hAnsi="Arial" w:cs="Arial"/>
+                          <w:b/>
+                          <w:sz w:val="16"/>
+                          <w:szCs w:val="16"/>
+                        </w:rPr>
+                        <w:t xml:space="preserve"> 1754708798</w:t>
+                      </w:r>
                     </w:p>
                     <w:p>
                       <w:pPr>
@@ -6191,331 +9463,6 @@
                           <w:b/>
                           <w:sz w:val="20"/>
                           <w:szCs w:val="20"/>
-                        </w:rPr>
-                      </w:pPr>
-                    </w:p>
-                  </w:txbxContent>
-                </v:textbox>
-              </v:shape>
-            </w:pict>
-          </mc:Fallback>
-        </mc:AlternateContent>
-      </w:r>
-      <w:r>
-        <w:rPr>
-          <w:rFonts w:ascii="Times New Roman" w:hAnsi="Times New Roman"/>
-          <w:b/>
-          <w:noProof/>
-          <w:sz w:val="20"/>
-          <w:szCs w:val="20"/>
-          <w:lang w:val="es-ES"/>
-        </w:rPr>
-        <mc:AlternateContent>
-          <mc:Choice Requires="wps">
-            <w:drawing>
-              <wp:anchor distT="0" distB="0" distL="114300" distR="114300" simplePos="0" relativeHeight="251681792" behindDoc="0" locked="0" layoutInCell="1" allowOverlap="1" wp14:anchorId="0458943B" wp14:editId="5F938B76">
-                <wp:simplePos x="0" y="0"/>
-                <wp:positionH relativeFrom="column">
-                  <wp:posOffset>-131445</wp:posOffset>
-                </wp:positionH>
-                <wp:positionV relativeFrom="paragraph">
-                  <wp:posOffset>34290</wp:posOffset>
-                </wp:positionV>
-                <wp:extent cx="1975485" cy="971550"/>
-                <wp:effectExtent l="0" t="0" r="5715" b="0"/>
-                <wp:wrapNone/>
-                <wp:docPr id="2" name="Text Box 12"/>
-                <wp:cNvGraphicFramePr>
-                  <a:graphicFrameLocks xmlns:a="http://schemas.openxmlformats.org/drawingml/2006/main"/>
-                </wp:cNvGraphicFramePr>
-                <a:graphic xmlns:a="http://schemas.openxmlformats.org/drawingml/2006/main">
-                  <a:graphicData uri="http://schemas.microsoft.com/office/word/2010/wordprocessingShape">
-                    <wps:wsp>
-                      <wps:cNvSpPr txBox="1">
-                        <a:spLocks noChangeArrowheads="1"/>
-                      </wps:cNvSpPr>
-                      <wps:spPr bwMode="auto">
-                        <a:xfrm>
-                          <a:off x="0" y="0"/>
-                          <a:ext cx="1975485" cy="971550"/>
-                        </a:xfrm>
-                        <a:prstGeom prst="rect">
-                          <a:avLst/>
-                        </a:prstGeom>
-                        <a:solidFill>
-                          <a:srgbClr val="FFFFFF"/>
-                        </a:solidFill>
-                        <a:ln w="9525">
-                          <a:solidFill>
-                            <a:schemeClr val="bg1">
-                              <a:lumMod val="100000"/>
-                              <a:lumOff val="0"/>
-                            </a:schemeClr>
-                          </a:solidFill>
-                          <a:miter lim="800000"/>
-                          <a:headEnd/>
-                          <a:tailEnd/>
-                        </a:ln>
-                      </wps:spPr>
-                      <wps:txbx>
-                        <w:txbxContent>
-                          <w:p>
-                            <w:pPr>
-                              <w:spacing w:after="0" w:line="240" w:lineRule="auto"/>
-                              <w:jc w:val="center"/>
-                              <w:rPr>
-                                <w:rFonts w:ascii="Arial" w:hAnsi="Arial" w:cs="Arial"/>
-                                <w:sz w:val="20"/>
-                                <w:szCs w:val="20"/>
-                              </w:rPr>
-                            </w:pPr>
-                          </w:p>
-                          <w:p>
-                            <w:pPr>
-                              <w:spacing w:after="0" w:line="240" w:lineRule="auto"/>
-                              <w:jc w:val="center"/>
-                              <w:rPr>
-                                <w:rFonts w:ascii="Arial" w:hAnsi="Arial" w:cs="Arial"/>
-                                <w:sz w:val="20"/>
-                                <w:szCs w:val="20"/>
-                              </w:rPr>
-                            </w:pPr>
-                          </w:p>
-                          <w:p>
-                            <w:pPr>
-                              <w:spacing w:after="0"/>
-                              <w:rPr>
-                                <w:rFonts w:ascii="Arial" w:hAnsi="Arial" w:cs="Arial"/>
-                                <w:b/>
-                                <w:sz w:val="16"/>
-                                <w:szCs w:val="16"/>
-                              </w:rPr>
-                            </w:pPr>
-                            <w:r>
-                              <w:rPr>
-                                <w:rFonts w:ascii="Arial" w:hAnsi="Arial" w:cs="Arial"/>
-                                <w:b/>
-                                <w:sz w:val="16"/>
-                                <w:szCs w:val="16"/>
-                              </w:rPr>
-                              <w:t xml:space="preserve">Tutor </w:t>
-                            </w:r>
-                            <w:r>
-                              <w:rPr>
-                                <w:rFonts w:ascii="Arial" w:hAnsi="Arial" w:cs="Arial"/>
-                                <w:b/>
-                                <w:sz w:val="16"/>
-                                <w:szCs w:val="16"/>
-                              </w:rPr>
-                              <w:t xml:space="preserve">(a) </w:t>
-                            </w:r>
-                            <w:r>
-                              <w:rPr>
-                                <w:rFonts w:ascii="Arial" w:hAnsi="Arial" w:cs="Arial"/>
-                                <w:b/>
-                                <w:sz w:val="16"/>
-                                <w:szCs w:val="16"/>
-                              </w:rPr>
-                              <w:t>Empresarial / Institucional</w:t>
-                            </w:r>
-                            <w:r>
-                              <w:rPr>
-                                <w:rFonts w:ascii="Arial" w:hAnsi="Arial" w:cs="Arial"/>
-                                <w:b/>
-                                <w:sz w:val="16"/>
-                                <w:szCs w:val="16"/>
-                              </w:rPr>
-                              <w:t>/ Representante de la Comunidad</w:t>
-                            </w:r>
-                          </w:p>
-                          <w:p>
-                            <w:pPr>
-                              <w:spacing w:after="0" w:line="240" w:lineRule="auto"/>
-                              <w:rPr>
-                                <w:rFonts w:ascii="Arial" w:hAnsi="Arial" w:cs="Arial"/>
-                                <w:b/>
-                                <w:sz w:val="16"/>
-                                <w:szCs w:val="16"/>
-                              </w:rPr>
-                            </w:pPr>
-                            <w:r>
-                              <w:rPr>
-                                <w:rFonts w:ascii="Arial" w:hAnsi="Arial" w:cs="Arial"/>
-                                <w:b/>
-                                <w:sz w:val="16"/>
-                                <w:szCs w:val="16"/>
-                              </w:rPr>
-                              <w:t>Nombres y apellidos:</w:t>
-                            </w:r>
-                          </w:p>
-                          <w:p>
-                            <w:pPr>
-                              <w:rPr>
-                                <w:rFonts w:ascii="Arial" w:hAnsi="Arial" w:cs="Arial"/>
-                                <w:b/>
-                                <w:sz w:val="16"/>
-                                <w:szCs w:val="16"/>
-                              </w:rPr>
-                            </w:pPr>
-                            <w:r>
-                              <w:rPr>
-                                <w:rFonts w:ascii="Arial" w:hAnsi="Arial" w:cs="Arial"/>
-                                <w:b/>
-                                <w:sz w:val="16"/>
-                                <w:szCs w:val="16"/>
-                              </w:rPr>
-                              <w:t>CC:</w:t>
-                            </w:r>
-                          </w:p>
-                          <w:p>
-                            <w:pPr>
-                              <w:spacing w:after="0" w:line="240" w:lineRule="auto"/>
-                              <w:rPr>
-                                <w:rFonts w:ascii="Arial" w:hAnsi="Arial" w:cs="Arial"/>
-                                <w:b/>
-                                <w:sz w:val="16"/>
-                                <w:szCs w:val="16"/>
-                              </w:rPr>
-                            </w:pPr>
-                          </w:p>
-                        </w:txbxContent>
-                      </wps:txbx>
-                      <wps:bodyPr rot="0" vert="horz" wrap="square" lIns="91440" tIns="45720" rIns="91440" bIns="45720" anchor="t" anchorCtr="0" upright="1">
-                        <a:noAutofit/>
-                      </wps:bodyPr>
-                    </wps:wsp>
-                  </a:graphicData>
-                </a:graphic>
-                <wp14:sizeRelH relativeFrom="margin">
-                  <wp14:pctWidth>0</wp14:pctWidth>
-                </wp14:sizeRelH>
-                <wp14:sizeRelV relativeFrom="margin">
-                  <wp14:pctHeight>0</wp14:pctHeight>
-                </wp14:sizeRelV>
-              </wp:anchor>
-            </w:drawing>
-          </mc:Choice>
-          <mc:Fallback>
-            <w:pict>
-              <v:shape w14:anchorId="0458943B" id="Text Box 12" o:spid="_x0000_s1036" type="#_x0000_t202" style="position:absolute;margin-left:-10.35pt;margin-top:2.7pt;width:155.55pt;height:76.5pt;z-index:251681792;visibility:visible;mso-wrap-style:square;mso-width-percent:0;mso-height-percent:0;mso-wrap-distance-left:9pt;mso-wrap-distance-top:0;mso-wrap-distance-right:9pt;mso-wrap-distance-bottom:0;mso-position-horizontal:absolute;mso-position-horizontal-relative:text;mso-position-vertical:absolute;mso-position-vertical-relative:text;mso-width-percent:0;mso-height-percent:0;mso-width-relative:margin;mso-height-relative:margin;v-text-anchor:top" o:gfxdata="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" strokecolor="white [3212]">
-                <v:textbox>
-                  <w:txbxContent>
-                    <w:p>
-                      <w:pPr>
-                        <w:spacing w:after="0" w:line="240" w:lineRule="auto"/>
-                        <w:jc w:val="center"/>
-                        <w:rPr>
-                          <w:rFonts w:ascii="Arial" w:hAnsi="Arial" w:cs="Arial"/>
-                          <w:sz w:val="20"/>
-                          <w:szCs w:val="20"/>
-                        </w:rPr>
-                      </w:pPr>
-                    </w:p>
-                    <w:p>
-                      <w:pPr>
-                        <w:spacing w:after="0" w:line="240" w:lineRule="auto"/>
-                        <w:jc w:val="center"/>
-                        <w:rPr>
-                          <w:rFonts w:ascii="Arial" w:hAnsi="Arial" w:cs="Arial"/>
-                          <w:sz w:val="20"/>
-                          <w:szCs w:val="20"/>
-                        </w:rPr>
-                      </w:pPr>
-                    </w:p>
-                    <w:p>
-                      <w:pPr>
-                        <w:spacing w:after="0"/>
-                        <w:rPr>
-                          <w:rFonts w:ascii="Arial" w:hAnsi="Arial" w:cs="Arial"/>
-                          <w:b/>
-                          <w:sz w:val="16"/>
-                          <w:szCs w:val="16"/>
-                        </w:rPr>
-                      </w:pPr>
-                      <w:r>
-                        <w:rPr>
-                          <w:rFonts w:ascii="Arial" w:hAnsi="Arial" w:cs="Arial"/>
-                          <w:b/>
-                          <w:sz w:val="16"/>
-                          <w:szCs w:val="16"/>
-                        </w:rPr>
-                        <w:t xml:space="preserve">Tutor </w:t>
-                      </w:r>
-                      <w:r>
-                        <w:rPr>
-                          <w:rFonts w:ascii="Arial" w:hAnsi="Arial" w:cs="Arial"/>
-                          <w:b/>
-                          <w:sz w:val="16"/>
-                          <w:szCs w:val="16"/>
-                        </w:rPr>
-                        <w:t xml:space="preserve">(a) </w:t>
-                      </w:r>
-                      <w:r>
-                        <w:rPr>
-                          <w:rFonts w:ascii="Arial" w:hAnsi="Arial" w:cs="Arial"/>
-                          <w:b/>
-                          <w:sz w:val="16"/>
-                          <w:szCs w:val="16"/>
-                        </w:rPr>
-                        <w:t>Empresarial / Institucional</w:t>
-                      </w:r>
-                      <w:r>
-                        <w:rPr>
-                          <w:rFonts w:ascii="Arial" w:hAnsi="Arial" w:cs="Arial"/>
-                          <w:b/>
-                          <w:sz w:val="16"/>
-                          <w:szCs w:val="16"/>
-                        </w:rPr>
-                        <w:t>/ Representante de la Comunidad</w:t>
-                      </w:r>
-                    </w:p>
-                    <w:p>
-                      <w:pPr>
-                        <w:spacing w:after="0" w:line="240" w:lineRule="auto"/>
-                        <w:rPr>
-                          <w:rFonts w:ascii="Arial" w:hAnsi="Arial" w:cs="Arial"/>
-                          <w:b/>
-                          <w:sz w:val="16"/>
-                          <w:szCs w:val="16"/>
-                        </w:rPr>
-                      </w:pPr>
-                      <w:r>
-                        <w:rPr>
-                          <w:rFonts w:ascii="Arial" w:hAnsi="Arial" w:cs="Arial"/>
-                          <w:b/>
-                          <w:sz w:val="16"/>
-                          <w:szCs w:val="16"/>
-                        </w:rPr>
-                        <w:t>Nombres y apellidos:</w:t>
-                      </w:r>
-                    </w:p>
-                    <w:p>
-                      <w:pPr>
-                        <w:rPr>
-                          <w:rFonts w:ascii="Arial" w:hAnsi="Arial" w:cs="Arial"/>
-                          <w:b/>
-                          <w:sz w:val="16"/>
-                          <w:szCs w:val="16"/>
-                        </w:rPr>
-                      </w:pPr>
-                      <w:r>
-                        <w:rPr>
-                          <w:rFonts w:ascii="Arial" w:hAnsi="Arial" w:cs="Arial"/>
-                          <w:b/>
-                          <w:sz w:val="16"/>
-                          <w:szCs w:val="16"/>
-                        </w:rPr>
-                        <w:t>CC:</w:t>
-                      </w:r>
-                    </w:p>
-                    <w:p>
-                      <w:pPr>
-                        <w:spacing w:after="0" w:line="240" w:lineRule="auto"/>
-                        <w:rPr>
-                          <w:rFonts w:ascii="Arial" w:hAnsi="Arial" w:cs="Arial"/>
-                          <w:b/>
-                          <w:sz w:val="16"/>
-                          <w:szCs w:val="16"/>
                         </w:rPr>
                       </w:pPr>
                     </w:p>
@@ -6673,6 +9620,24 @@
                               </w:rPr>
                               <w:t>Nombres y apellidos:</w:t>
                             </w:r>
+                            <w:r>
+                              <w:rPr>
+                                <w:rFonts w:ascii="Arial" w:hAnsi="Arial" w:cs="Arial"/>
+                                <w:b/>
+                                <w:sz w:val="16"/>
+                                <w:szCs w:val="16"/>
+                              </w:rPr>
+                              <w:t xml:space="preserve"> Jenny Alexandra Robalino Ruiz</w:t>
+                            </w:r>
+                            <w:r>
+                              <w:rPr>
+                                <w:rFonts w:ascii="Arial" w:hAnsi="Arial" w:cs="Arial"/>
+                                <w:b/>
+                                <w:sz w:val="16"/>
+                                <w:szCs w:val="16"/>
+                              </w:rPr>
+                              <w:t xml:space="preserve"> </w:t>
+                            </w:r>
                           </w:p>
                           <w:p>
                             <w:pPr>
@@ -6710,6 +9675,15 @@
                                 <w:szCs w:val="16"/>
                               </w:rPr>
                               <w:t>:</w:t>
+                            </w:r>
+                            <w:r>
+                              <w:rPr>
+                                <w:rFonts w:ascii="Arial" w:hAnsi="Arial" w:cs="Arial"/>
+                                <w:b/>
+                                <w:sz w:val="16"/>
+                                <w:szCs w:val="16"/>
+                              </w:rPr>
+                              <w:t xml:space="preserve">  1802102101</w:t>
                             </w:r>
                           </w:p>
                           <w:p>
@@ -6835,6 +9809,24 @@
                         </w:rPr>
                         <w:t>Nombres y apellidos:</w:t>
                       </w:r>
+                      <w:r>
+                        <w:rPr>
+                          <w:rFonts w:ascii="Arial" w:hAnsi="Arial" w:cs="Arial"/>
+                          <w:b/>
+                          <w:sz w:val="16"/>
+                          <w:szCs w:val="16"/>
+                        </w:rPr>
+                        <w:t xml:space="preserve"> Jenny Alexandra Robalino Ruiz</w:t>
+                      </w:r>
+                      <w:r>
+                        <w:rPr>
+                          <w:rFonts w:ascii="Arial" w:hAnsi="Arial" w:cs="Arial"/>
+                          <w:b/>
+                          <w:sz w:val="16"/>
+                          <w:szCs w:val="16"/>
+                        </w:rPr>
+                        <w:t xml:space="preserve"> </w:t>
+                      </w:r>
                     </w:p>
                     <w:p>
                       <w:pPr>
@@ -6872,6 +9864,15 @@
                           <w:szCs w:val="16"/>
                         </w:rPr>
                         <w:t>:</w:t>
+                      </w:r>
+                      <w:r>
+                        <w:rPr>
+                          <w:rFonts w:ascii="Arial" w:hAnsi="Arial" w:cs="Arial"/>
+                          <w:b/>
+                          <w:sz w:val="16"/>
+                          <w:szCs w:val="16"/>
+                        </w:rPr>
+                        <w:t xml:space="preserve">  1802102101</w:t>
                       </w:r>
                     </w:p>
                     <w:p>
@@ -7629,7 +10630,6 @@
         </w:rPr>
         <w:t xml:space="preserve">consigne firma y </w:t>
       </w:r>
-      <w:proofErr w:type="gramStart"/>
       <w:r>
         <w:rPr>
           <w:rFonts w:ascii="Arial" w:hAnsi="Arial" w:cs="Arial"/>
@@ -7640,21 +10640,8 @@
           <w:szCs w:val="16"/>
           <w:lang w:val="es-EC"/>
         </w:rPr>
-        <w:t xml:space="preserve">sello </w:t>
-      </w:r>
-      <w:r>
-        <w:rPr>
-          <w:rFonts w:ascii="Arial" w:hAnsi="Arial" w:cs="Arial"/>
-          <w:b/>
-          <w:i/>
-          <w:spacing w:val="1"/>
-          <w:sz w:val="16"/>
-          <w:szCs w:val="16"/>
-          <w:lang w:val="es-EC"/>
-        </w:rPr>
-        <w:t xml:space="preserve"> del</w:t>
-      </w:r>
-      <w:proofErr w:type="gramEnd"/>
+        <w:t>sello del</w:t>
+      </w:r>
       <w:r>
         <w:rPr>
           <w:rFonts w:ascii="Arial" w:hAnsi="Arial" w:cs="Arial"/>

</xml_diff>